<commit_message>
Finsiedh upto task 4 for the rpeopt will finsh the rest tomrow
will finish the tasks the for the reprot tomrow
</commit_message>
<xml_diff>
--- a/Final Progress Report.docx
+++ b/Final Progress Report.docx
@@ -5,16 +5,28 @@
     <w:p>
       <w:pPr>
         <w:pStyle w:val="Heading1"/>
-      </w:pPr>
-      <w:r>
+        <w:rPr>
+          <w:rFonts w:asciiTheme="minorHAnsi" w:hAnsiTheme="minorHAnsi"/>
+        </w:rPr>
+      </w:pPr>
+      <w:r>
+        <w:rPr>
+          <w:rFonts w:asciiTheme="minorHAnsi" w:hAnsiTheme="minorHAnsi"/>
+        </w:rPr>
         <w:t>Introduction</w:t>
       </w:r>
     </w:p>
     <w:p>
       <w:pPr>
         <w:pStyle w:val="Heading1"/>
-      </w:pPr>
-      <w:r>
+        <w:rPr>
+          <w:rFonts w:asciiTheme="minorHAnsi" w:hAnsiTheme="minorHAnsi"/>
+        </w:rPr>
+      </w:pPr>
+      <w:r>
+        <w:rPr>
+          <w:rFonts w:asciiTheme="minorHAnsi" w:hAnsiTheme="minorHAnsi"/>
+        </w:rPr>
         <w:t>Task 1: Project Phase 1 summary</w:t>
       </w:r>
     </w:p>
@@ -25,302 +37,46 @@
           <w:ilvl w:val="1"/>
           <w:numId w:val="2"/>
         </w:numPr>
-      </w:pPr>
-      <w:r>
-        <w:t>pro</w:t>
-      </w:r>
-      <w:r>
-        <w:t>b</w:t>
-      </w:r>
-      <w:r>
-        <w:t xml:space="preserve">lem and </w:t>
-      </w:r>
-      <w:proofErr w:type="spellStart"/>
-      <w:r>
-        <w:t>datset</w:t>
-      </w:r>
-      <w:proofErr w:type="spellEnd"/>
-      <w:r>
-        <w:t xml:space="preserve"> overview</w:t>
-      </w:r>
-    </w:p>
-    <w:p>
-      <w:r>
-        <w:t xml:space="preserve">The real world problem that </w:t>
-      </w:r>
-      <w:proofErr w:type="spellStart"/>
-      <w:r>
-        <w:t>qwas</w:t>
-      </w:r>
-      <w:proofErr w:type="spellEnd"/>
-      <w:r>
-        <w:t xml:space="preserve"> investigated in this project was</w:t>
-      </w:r>
-      <w:r>
-        <w:t xml:space="preserve"> using historical weather observation to </w:t>
-      </w:r>
-      <w:proofErr w:type="spellStart"/>
-      <w:r>
-        <w:t>rpredict</w:t>
-      </w:r>
-      <w:proofErr w:type="spellEnd"/>
-      <w:r>
-        <w:t xml:space="preserve"> next day rainfall in</w:t>
-      </w:r>
-      <w:r>
-        <w:t xml:space="preserve"> Australia. </w:t>
-      </w:r>
-      <w:r>
-        <w:t xml:space="preserve">The </w:t>
-      </w:r>
-      <w:proofErr w:type="spellStart"/>
-      <w:r>
-        <w:t>predigvie</w:t>
-      </w:r>
-      <w:proofErr w:type="spellEnd"/>
-      <w:r>
-        <w:t xml:space="preserve"> objective in out our project is to use the recorded weather </w:t>
-      </w:r>
-      <w:proofErr w:type="spellStart"/>
-      <w:r>
-        <w:t>cintitions</w:t>
-      </w:r>
-      <w:proofErr w:type="spellEnd"/>
-      <w:r>
-        <w:t xml:space="preserve"> or features from the current observation to predict </w:t>
-      </w:r>
-      <w:proofErr w:type="spellStart"/>
-      <w:r>
-        <w:t>wether</w:t>
-      </w:r>
-      <w:proofErr w:type="spellEnd"/>
-      <w:r>
-        <w:t xml:space="preserve"> rainfall will occur the next day </w:t>
-      </w:r>
-      <w:r>
-        <w:t xml:space="preserve">. The </w:t>
-      </w:r>
-      <w:proofErr w:type="spellStart"/>
-      <w:r>
-        <w:t>dinetifies</w:t>
-      </w:r>
-      <w:proofErr w:type="spellEnd"/>
-      <w:r>
-        <w:t xml:space="preserve"> Taeger variables for </w:t>
-      </w:r>
-      <w:proofErr w:type="spellStart"/>
-      <w:r>
-        <w:t>thisproject</w:t>
-      </w:r>
-      <w:proofErr w:type="spellEnd"/>
-      <w:r>
-        <w:t xml:space="preserve"> were </w:t>
-      </w:r>
-      <w:proofErr w:type="spellStart"/>
-      <w:r>
-        <w:t>RainTomoroww</w:t>
-      </w:r>
-      <w:proofErr w:type="spellEnd"/>
-      <w:r>
-        <w:t xml:space="preserve">, </w:t>
-      </w:r>
-      <w:proofErr w:type="spellStart"/>
-      <w:r>
-        <w:t>wich</w:t>
-      </w:r>
-      <w:proofErr w:type="spellEnd"/>
-      <w:r>
-        <w:t xml:space="preserve"> records the next day rainfall outcome in the form of Yes or No. Since </w:t>
-      </w:r>
-      <w:proofErr w:type="spellStart"/>
-      <w:r>
-        <w:t>Raintomtoreow</w:t>
-      </w:r>
-      <w:proofErr w:type="spellEnd"/>
-      <w:r>
-        <w:t xml:space="preserve"> contains two </w:t>
-      </w:r>
-      <w:proofErr w:type="spellStart"/>
-      <w:r>
-        <w:t>ppssible</w:t>
-      </w:r>
-      <w:proofErr w:type="spellEnd"/>
-      <w:r>
-        <w:t xml:space="preserve"> outcomes</w:t>
-      </w:r>
-      <w:r>
-        <w:t xml:space="preserve"> Yes and No, the prediction is therefore treated as a binary classification problem. Other weather variables were also used such as Cloud3pm, </w:t>
-      </w:r>
-      <w:r>
-        <w:t xml:space="preserve"> Sunshine, and Evaporation</w:t>
-      </w:r>
-      <w:r>
-        <w:t xml:space="preserve"> and more to determine the </w:t>
-      </w:r>
-      <w:proofErr w:type="spellStart"/>
-      <w:r>
-        <w:t>nextday</w:t>
-      </w:r>
-      <w:proofErr w:type="spellEnd"/>
-      <w:r>
-        <w:t xml:space="preserve"> </w:t>
-      </w:r>
-      <w:proofErr w:type="spellStart"/>
-      <w:r>
-        <w:t>ranfall</w:t>
-      </w:r>
-      <w:proofErr w:type="spellEnd"/>
-      <w:r>
-        <w:t xml:space="preserve"> class.</w:t>
-      </w:r>
-    </w:p>
-    <w:p>
-      <w:r>
-        <w:t xml:space="preserve">The </w:t>
-      </w:r>
-      <w:proofErr w:type="spellStart"/>
-      <w:r>
-        <w:t>dataser</w:t>
-      </w:r>
-      <w:proofErr w:type="spellEnd"/>
-      <w:r>
-        <w:t xml:space="preserve"> selected </w:t>
-      </w:r>
-      <w:proofErr w:type="spellStart"/>
-      <w:r>
-        <w:t>fornthis</w:t>
-      </w:r>
-      <w:proofErr w:type="spellEnd"/>
-      <w:r>
-        <w:t xml:space="preserve"> project </w:t>
-      </w:r>
-      <w:r>
-        <w:t xml:space="preserve">was </w:t>
-      </w:r>
-      <w:proofErr w:type="spellStart"/>
-      <w:r>
-        <w:t>WeatherAUS</w:t>
-      </w:r>
-      <w:proofErr w:type="spellEnd"/>
-      <w:r>
-        <w:t xml:space="preserve">, which contains the </w:t>
-      </w:r>
-      <w:proofErr w:type="spellStart"/>
-      <w:r>
-        <w:t>hisotrila</w:t>
-      </w:r>
-      <w:proofErr w:type="spellEnd"/>
-      <w:r>
-        <w:t xml:space="preserve"> </w:t>
-      </w:r>
-      <w:proofErr w:type="spellStart"/>
-      <w:r>
-        <w:t>asutralian</w:t>
-      </w:r>
-      <w:proofErr w:type="spellEnd"/>
-      <w:r>
-        <w:t xml:space="preserve"> weather observations. In regards to the </w:t>
-      </w:r>
-      <w:proofErr w:type="spellStart"/>
-      <w:r>
-        <w:t>dataser</w:t>
-      </w:r>
-      <w:proofErr w:type="spellEnd"/>
-      <w:r>
-        <w:t xml:space="preserve"> size the original dataset contained 145,460 records</w:t>
-      </w:r>
-      <w:r>
-        <w:t xml:space="preserve"> and 23 original </w:t>
-      </w:r>
-      <w:proofErr w:type="spellStart"/>
-      <w:r>
-        <w:t>varibels</w:t>
-      </w:r>
-      <w:proofErr w:type="spellEnd"/>
-      <w:r>
-        <w:t xml:space="preserve">. The data contained observations about weather </w:t>
-      </w:r>
-      <w:proofErr w:type="spellStart"/>
-      <w:r>
-        <w:t>cinttions</w:t>
-      </w:r>
-      <w:proofErr w:type="spellEnd"/>
-      <w:r>
-        <w:t xml:space="preserve"> </w:t>
-      </w:r>
-      <w:proofErr w:type="spellStart"/>
-      <w:r>
-        <w:t>suh</w:t>
-      </w:r>
-      <w:proofErr w:type="spellEnd"/>
-      <w:r>
-        <w:t xml:space="preserve"> as </w:t>
-      </w:r>
-      <w:proofErr w:type="spellStart"/>
-      <w:r>
-        <w:t>temeratrue</w:t>
-      </w:r>
-      <w:proofErr w:type="spellEnd"/>
-      <w:r>
-        <w:t xml:space="preserve">, rainfall, evaporation, sunshine, wind, </w:t>
-      </w:r>
-      <w:proofErr w:type="spellStart"/>
-      <w:r>
-        <w:t>humidty</w:t>
-      </w:r>
-      <w:proofErr w:type="spellEnd"/>
-      <w:r>
-        <w:t xml:space="preserve">, pressure, cloud cover </w:t>
-      </w:r>
-      <w:r>
-        <w:t>in accordance with their location and date. The overall observation</w:t>
-      </w:r>
-      <w:r>
-        <w:t>s</w:t>
-      </w:r>
-      <w:r>
-        <w:t xml:space="preserve"> in </w:t>
-      </w:r>
-      <w:proofErr w:type="spellStart"/>
-      <w:r>
-        <w:t>th</w:t>
-      </w:r>
-      <w:proofErr w:type="spellEnd"/>
-      <w:r>
-        <w:t xml:space="preserve"> </w:t>
-      </w:r>
-      <w:proofErr w:type="spellStart"/>
-      <w:r>
-        <w:t>datast</w:t>
-      </w:r>
-      <w:proofErr w:type="spellEnd"/>
-      <w:r>
-        <w:t xml:space="preserve"> </w:t>
-      </w:r>
-      <w:r>
-        <w:t xml:space="preserve">were collected across multiple </w:t>
-      </w:r>
-      <w:proofErr w:type="spellStart"/>
-      <w:r>
-        <w:t>australaiin</w:t>
-      </w:r>
-      <w:proofErr w:type="spellEnd"/>
-      <w:r>
-        <w:t xml:space="preserve"> locations for about 10 years.</w:t>
-      </w:r>
-      <w:r>
-        <w:t xml:space="preserve"> </w:t>
-      </w:r>
-      <w:r>
-        <w:t xml:space="preserve">Therefore, the dataset was considered suitable for the prediction task because it contained both weather conditions and the </w:t>
-      </w:r>
-      <w:proofErr w:type="spellStart"/>
-      <w:r>
-        <w:t>RainTomorrow</w:t>
-      </w:r>
-      <w:proofErr w:type="spellEnd"/>
-      <w:r>
-        <w:t xml:space="preserve"> outcome, allowing the model to learn patterns between them.</w:t>
+        <w:ind w:left="375" w:hanging="375"/>
+        <w:rPr>
+          <w:rFonts w:asciiTheme="minorHAnsi" w:hAnsiTheme="minorHAnsi"/>
+        </w:rPr>
+      </w:pPr>
+      <w:r>
+        <w:rPr>
+          <w:rFonts w:asciiTheme="minorHAnsi" w:hAnsiTheme="minorHAnsi"/>
+        </w:rPr>
+        <w:t>problem and datset overview</w:t>
+      </w:r>
+    </w:p>
+    <w:p>
+      <w:pPr>
+        <w:pStyle w:val="NormalWeb"/>
+        <w:ind w:left="473"/>
+        <w:rPr>
+          <w:rFonts w:asciiTheme="minorHAnsi" w:hAnsiTheme="minorHAnsi"/>
+        </w:rPr>
+      </w:pPr>
+      <w:r>
+        <w:rPr>
+          <w:rFonts w:asciiTheme="minorHAnsi" w:hAnsiTheme="minorHAnsi"/>
+        </w:rPr>
+        <w:t>The real world problem that was investigated in this project was using historical weather observation to predict next day rainfall in Australia. The predictive objective in out our project is to use the recorded weather conditions or features from the current observation to predict whether rainfall will occur the next day . The identified Target variables for this project were RainTomorrow, which records the next day rainfall outcome in the form of Yes or No. Since RainTomorrow contains two possible outcomes Yes and No, the prediction is therefore treated as a binary classification problem. Other weather variables were also used such as Cloud3pm, Sunshine, and Evaporation and more to determine the next day rainfall class.</w:t>
+      </w:r>
+    </w:p>
+    <w:p>
+      <w:pPr>
+        <w:pStyle w:val="NormalWeb"/>
+        <w:ind w:left="473"/>
+        <w:rPr>
+          <w:rFonts w:asciiTheme="minorHAnsi" w:hAnsiTheme="minorHAnsi"/>
+        </w:rPr>
+      </w:pPr>
+      <w:r>
+        <w:rPr>
+          <w:rFonts w:asciiTheme="minorHAnsi" w:hAnsiTheme="minorHAnsi"/>
+        </w:rPr>
+        <w:t>The dataset selected for this project was WeatherAUS, which contains the historical Australian weather observations. In regards to the dataset size the original dataset contained 145,460 records and 23 original variables. The data contained observations about weather conditions such as temperature, rainfall, evaporation, sunshine, wind, humidity, pressure, cloud cover in accordance with their location and date. The overall observations in the dataset were collected across multiple Australian locations for about 10 years. Therefore, the dataset was considered suitable for the prediction task because it contained both weather conditions and the RainTomorrow outcome, allowing the model to learn patterns between them.</w:t>
       </w:r>
     </w:p>
     <w:p>
@@ -330,348 +86,53 @@
           <w:ilvl w:val="1"/>
           <w:numId w:val="2"/>
         </w:numPr>
-      </w:pPr>
-      <w:r>
+        <w:ind w:left="375" w:hanging="375"/>
+        <w:rPr>
+          <w:rFonts w:asciiTheme="minorHAnsi" w:hAnsiTheme="minorHAnsi"/>
+        </w:rPr>
+      </w:pPr>
+      <w:r>
+        <w:rPr>
+          <w:rFonts w:asciiTheme="minorHAnsi" w:hAnsiTheme="minorHAnsi"/>
+        </w:rPr>
         <w:t>phase 1 data quality summary</w:t>
       </w:r>
     </w:p>
     <w:p>
       <w:pPr>
-        <w:pStyle w:val="ListParagraph"/>
+        <w:pStyle w:val="NormalWeb"/>
         <w:ind w:left="473"/>
-      </w:pPr>
-      <w:r>
-        <w:t xml:space="preserve">IN phase 1 we identified </w:t>
-      </w:r>
-      <w:proofErr w:type="spellStart"/>
-      <w:r>
-        <w:t>sevral</w:t>
-      </w:r>
-      <w:proofErr w:type="spellEnd"/>
-      <w:r>
-        <w:t xml:space="preserve"> data quality issues </w:t>
-      </w:r>
-      <w:r>
-        <w:t xml:space="preserve">from the original </w:t>
-      </w:r>
-      <w:proofErr w:type="spellStart"/>
-      <w:r>
-        <w:t>ataset</w:t>
-      </w:r>
-      <w:proofErr w:type="spellEnd"/>
-      <w:r>
-        <w:t xml:space="preserve"> such as missing values, </w:t>
-      </w:r>
-      <w:proofErr w:type="spellStart"/>
-      <w:r>
-        <w:t>invlaid</w:t>
-      </w:r>
-      <w:proofErr w:type="spellEnd"/>
-      <w:r>
-        <w:t xml:space="preserve"> values, outliers, class imbalance and </w:t>
-      </w:r>
-      <w:proofErr w:type="spellStart"/>
-      <w:r>
-        <w:t>categroicla</w:t>
-      </w:r>
-      <w:proofErr w:type="spellEnd"/>
-      <w:r>
-        <w:t xml:space="preserve"> consistency checks. The most </w:t>
-      </w:r>
-      <w:proofErr w:type="spellStart"/>
-      <w:r>
-        <w:t>signnficant</w:t>
-      </w:r>
-      <w:proofErr w:type="spellEnd"/>
-      <w:r>
-        <w:t xml:space="preserve"> issue we dealt with was </w:t>
-      </w:r>
-      <w:r>
-        <w:t xml:space="preserve">missing values in features such as Sunshine, Evaporation, Cloud9am an Cloud3pm. The target </w:t>
-      </w:r>
-      <w:proofErr w:type="spellStart"/>
-      <w:r>
-        <w:t>varible</w:t>
-      </w:r>
-      <w:proofErr w:type="spellEnd"/>
-      <w:r>
-        <w:t xml:space="preserve"> also displayed a class </w:t>
-      </w:r>
-      <w:proofErr w:type="spellStart"/>
-      <w:r>
-        <w:t>imablacne</w:t>
-      </w:r>
-      <w:proofErr w:type="spellEnd"/>
-      <w:r>
-        <w:t xml:space="preserve"> with </w:t>
-      </w:r>
-      <w:proofErr w:type="spellStart"/>
-      <w:r>
-        <w:t>apprxoimaltey</w:t>
-      </w:r>
-      <w:proofErr w:type="spellEnd"/>
-      <w:r>
-        <w:t xml:space="preserve"> around </w:t>
-      </w:r>
-      <w:r>
-        <w:t xml:space="preserve">110k No and 32k Yes, this would present as </w:t>
-      </w:r>
-      <w:proofErr w:type="spellStart"/>
-      <w:r>
-        <w:t>aproblem</w:t>
-      </w:r>
-      <w:proofErr w:type="spellEnd"/>
-      <w:r>
-        <w:t xml:space="preserve"> for our phase 2 project</w:t>
-      </w:r>
-      <w:r>
-        <w:t xml:space="preserve"> . </w:t>
-      </w:r>
-      <w:r>
-        <w:t>We also checked categorical</w:t>
-      </w:r>
-      <w:r>
-        <w:t xml:space="preserve"> variables </w:t>
-      </w:r>
-      <w:r>
-        <w:t xml:space="preserve">for whitespace </w:t>
-      </w:r>
-      <w:proofErr w:type="spellStart"/>
-      <w:r>
-        <w:t>orspelling</w:t>
-      </w:r>
-      <w:proofErr w:type="spellEnd"/>
-      <w:r>
-        <w:t xml:space="preserve"> </w:t>
-      </w:r>
-      <w:proofErr w:type="spellStart"/>
-      <w:r>
-        <w:t>inconsitiencies</w:t>
-      </w:r>
-      <w:proofErr w:type="spellEnd"/>
-      <w:r>
-        <w:t xml:space="preserve">, with the </w:t>
-      </w:r>
-      <w:proofErr w:type="spellStart"/>
-      <w:r>
-        <w:t>whtepace</w:t>
-      </w:r>
-      <w:proofErr w:type="spellEnd"/>
-      <w:r>
-        <w:t xml:space="preserve"> </w:t>
-      </w:r>
-      <w:proofErr w:type="spellStart"/>
-      <w:r>
-        <w:t>ebing</w:t>
-      </w:r>
-      <w:proofErr w:type="spellEnd"/>
-      <w:r>
-        <w:t xml:space="preserve"> cleaned.</w:t>
-      </w:r>
-    </w:p>
-    <w:p>
-      <w:pPr>
-        <w:pStyle w:val="ListParagraph"/>
+        <w:rPr>
+          <w:rFonts w:asciiTheme="minorHAnsi" w:hAnsiTheme="minorHAnsi"/>
+        </w:rPr>
+      </w:pPr>
+      <w:r>
+        <w:rPr>
+          <w:rFonts w:asciiTheme="minorHAnsi" w:hAnsiTheme="minorHAnsi"/>
+        </w:rPr>
+        <w:t>IN phase 1 we identified several data quality issues from the original dataset such as missing values, invalid values, outliers, class imbalance and categorical consistency checks. The most significant issue we dealt with was missing values in features such as Sunshine, Evaporation, Cloud9am an Cloud3pm. The target variable also displayed a class imbalance with approximately around 110k No and 32k Yes, this would present as a problem for our phase 2 project . We also checked categorical variables for whitespace or spelling inconsistencies, with the whitespace being cleaned.</w:t>
+      </w:r>
+    </w:p>
+    <w:p>
+      <w:pPr>
+        <w:pStyle w:val="NormalWeb"/>
         <w:ind w:left="473"/>
-      </w:pPr>
-    </w:p>
-    <w:p>
-      <w:pPr>
-        <w:pStyle w:val="ListParagraph"/>
-        <w:ind w:left="473"/>
-      </w:pPr>
-      <w:r>
-        <w:t xml:space="preserve">To address these issues found in phase 1 we applied </w:t>
-      </w:r>
-      <w:proofErr w:type="spellStart"/>
-      <w:r>
-        <w:t>issing</w:t>
-      </w:r>
-      <w:proofErr w:type="spellEnd"/>
-      <w:r>
-        <w:t xml:space="preserve"> value handling, category </w:t>
-      </w:r>
-      <w:proofErr w:type="spellStart"/>
-      <w:r>
-        <w:t>cleaining</w:t>
-      </w:r>
-      <w:proofErr w:type="spellEnd"/>
-      <w:r>
-        <w:t xml:space="preserve">, invalid value checks, outlier </w:t>
-      </w:r>
-      <w:proofErr w:type="spellStart"/>
-      <w:r>
-        <w:t>investigatios</w:t>
-      </w:r>
-      <w:proofErr w:type="spellEnd"/>
-      <w:r>
-        <w:t xml:space="preserve">  </w:t>
-      </w:r>
-      <w:proofErr w:type="spellStart"/>
-      <w:r>
-        <w:t>aswell</w:t>
-      </w:r>
-      <w:proofErr w:type="spellEnd"/>
-      <w:r>
-        <w:t xml:space="preserve"> as targe </w:t>
-      </w:r>
-      <w:proofErr w:type="spellStart"/>
-      <w:r>
-        <w:t>cleaing</w:t>
-      </w:r>
-      <w:proofErr w:type="spellEnd"/>
-      <w:r>
-        <w:t xml:space="preserve"> to </w:t>
-      </w:r>
-      <w:proofErr w:type="spellStart"/>
-      <w:r>
-        <w:t>preprar</w:t>
-      </w:r>
-      <w:proofErr w:type="spellEnd"/>
-      <w:r>
-        <w:t xml:space="preserve"> the dataset for modelling. The missing </w:t>
-      </w:r>
-      <w:proofErr w:type="spellStart"/>
-      <w:r>
-        <w:t>numeicla</w:t>
-      </w:r>
-      <w:proofErr w:type="spellEnd"/>
-      <w:r>
-        <w:t xml:space="preserve"> values were handled using median imputation, </w:t>
-      </w:r>
-      <w:r>
-        <w:t xml:space="preserve">since it would be less affected by </w:t>
-      </w:r>
-      <w:proofErr w:type="spellStart"/>
-      <w:r>
-        <w:t>extermed</w:t>
-      </w:r>
-      <w:proofErr w:type="spellEnd"/>
-      <w:r>
-        <w:t xml:space="preserve"> or </w:t>
-      </w:r>
-      <w:r>
+        <w:rPr>
+          <w:rFonts w:asciiTheme="minorHAnsi" w:hAnsiTheme="minorHAnsi"/>
+        </w:rPr>
+      </w:pPr>
+      <w:r>
+        <w:rPr>
+          <w:rFonts w:asciiTheme="minorHAnsi" w:hAnsiTheme="minorHAnsi"/>
+        </w:rPr>
+        <w:t xml:space="preserve">To address these issues found in phase 1 we applied missing value handling, category cleaning, invalid value checks, outlier investigations as well as target cleaning to prepare the dataset for modelling. The missing numerical values were handled using median imputation, since it would be less affected by extreme or </w:t>
+      </w:r>
+      <w:r>
+        <w:rPr>
+          <w:rFonts w:asciiTheme="minorHAnsi" w:hAnsiTheme="minorHAnsi"/>
+        </w:rPr>
         <w:lastRenderedPageBreak/>
-        <w:t xml:space="preserve">skewed values. </w:t>
-      </w:r>
-      <w:r>
-        <w:t xml:space="preserve">Meanwhile the missing </w:t>
-      </w:r>
-      <w:proofErr w:type="spellStart"/>
-      <w:r>
-        <w:t>catergoricla</w:t>
-      </w:r>
-      <w:proofErr w:type="spellEnd"/>
-      <w:r>
-        <w:t xml:space="preserve"> values were handled by </w:t>
-      </w:r>
-      <w:proofErr w:type="spellStart"/>
-      <w:r>
-        <w:t>applyin</w:t>
-      </w:r>
-      <w:proofErr w:type="spellEnd"/>
-      <w:r>
-        <w:t xml:space="preserve"> mode </w:t>
-      </w:r>
-      <w:proofErr w:type="spellStart"/>
-      <w:r>
-        <w:t>impitation</w:t>
-      </w:r>
-      <w:proofErr w:type="spellEnd"/>
-      <w:r>
-        <w:t xml:space="preserve"> for categorical features. The records </w:t>
-      </w:r>
-      <w:r>
-        <w:t xml:space="preserve">that had </w:t>
-      </w:r>
-      <w:proofErr w:type="spellStart"/>
-      <w:r>
-        <w:t>RainTomorrow</w:t>
-      </w:r>
-      <w:proofErr w:type="spellEnd"/>
-      <w:r>
-        <w:t xml:space="preserve"> missing were removed since we can’t </w:t>
-      </w:r>
-      <w:proofErr w:type="spellStart"/>
-      <w:r>
-        <w:t>trian</w:t>
-      </w:r>
-      <w:proofErr w:type="spellEnd"/>
-      <w:r>
-        <w:t xml:space="preserve"> on an unknown class label.</w:t>
-      </w:r>
-      <w:r>
-        <w:t xml:space="preserve"> Any </w:t>
-      </w:r>
-      <w:proofErr w:type="spellStart"/>
-      <w:r>
-        <w:t>invlaid</w:t>
-      </w:r>
-      <w:proofErr w:type="spellEnd"/>
-      <w:r>
-        <w:t xml:space="preserve"> or unusual values such as </w:t>
-      </w:r>
-      <w:proofErr w:type="spellStart"/>
-      <w:r>
-        <w:t>invlaid</w:t>
-      </w:r>
-      <w:proofErr w:type="spellEnd"/>
-      <w:r>
-        <w:t xml:space="preserve"> cloud values were checked </w:t>
-      </w:r>
-      <w:r>
-        <w:t xml:space="preserve">and investigated as </w:t>
-      </w:r>
-      <w:proofErr w:type="spellStart"/>
-      <w:r>
-        <w:t>opped</w:t>
-      </w:r>
-      <w:proofErr w:type="spellEnd"/>
-      <w:r>
-        <w:t xml:space="preserve"> to being removed and a </w:t>
-      </w:r>
-      <w:proofErr w:type="spellStart"/>
-      <w:r>
-        <w:t>suspictious</w:t>
-      </w:r>
-      <w:proofErr w:type="spellEnd"/>
-      <w:r>
-        <w:t xml:space="preserve"> evaporation values was </w:t>
-      </w:r>
-      <w:proofErr w:type="spellStart"/>
-      <w:r>
-        <w:t>repleaceed</w:t>
-      </w:r>
-      <w:proofErr w:type="spellEnd"/>
-      <w:r>
-        <w:t xml:space="preserve">. The </w:t>
-      </w:r>
-      <w:proofErr w:type="spellStart"/>
-      <w:r>
-        <w:t>catgeroicla</w:t>
-      </w:r>
-      <w:proofErr w:type="spellEnd"/>
-      <w:r>
-        <w:t xml:space="preserve"> values were whitespace stripped to make sure that consistency was maintained.</w:t>
-      </w:r>
-      <w:r>
-        <w:t xml:space="preserve"> After the cleaning and </w:t>
-      </w:r>
-      <w:proofErr w:type="spellStart"/>
-      <w:r>
-        <w:t>tsnfomation</w:t>
-      </w:r>
-      <w:proofErr w:type="spellEnd"/>
-      <w:r>
-        <w:t xml:space="preserve"> the dataset </w:t>
-      </w:r>
-      <w:proofErr w:type="spellStart"/>
-      <w:r>
-        <w:t>containe</w:t>
-      </w:r>
-      <w:proofErr w:type="spellEnd"/>
-      <w:r>
-        <w:t xml:space="preserve"> about 142,193 records and was compatible for phase 2 modelling.</w:t>
+        <w:t>skewed values. Meanwhile the missing categorical values were handled by applying mode imputation for categorical features. The records that had RainTomorrow missing were removed since we can’t train on an unknown class label. Any invalid or unusual values such as invalid cloud values were checked and investigated as opposed to being removed and a suspicious evaporation values was replaced. The categorical values were whitespace stripped to make sure that consistency was maintained. After the cleaning and transformation the dataset contained about 142,193 records and was compatible for phase 2 modelling.</w:t>
       </w:r>
     </w:p>
     <w:p>
@@ -681,324 +142,499 @@
           <w:ilvl w:val="1"/>
           <w:numId w:val="2"/>
         </w:numPr>
-      </w:pPr>
-      <w:proofErr w:type="spellStart"/>
-      <w:r>
-        <w:t>sutibality</w:t>
-      </w:r>
-      <w:proofErr w:type="spellEnd"/>
-      <w:r>
-        <w:t xml:space="preserve"> for an lcs based solution</w:t>
-      </w:r>
-    </w:p>
-    <w:p/>
-    <w:p>
-      <w:r>
-        <w:t xml:space="preserve">As mentioned before the rainfall </w:t>
-      </w:r>
-      <w:proofErr w:type="spellStart"/>
-      <w:r>
-        <w:t>predicatio</w:t>
-      </w:r>
-      <w:proofErr w:type="spellEnd"/>
-      <w:r>
-        <w:t xml:space="preserve"> problem was suitable for an LCS approach and was approved by </w:t>
-      </w:r>
-      <w:proofErr w:type="spellStart"/>
-      <w:r>
-        <w:t>lectuer</w:t>
-      </w:r>
-      <w:proofErr w:type="spellEnd"/>
-      <w:r>
-        <w:t xml:space="preserve"> because </w:t>
-      </w:r>
-      <w:r>
-        <w:t xml:space="preserve">it was a supervised classification problem due it having two classes: Yes/No. The outcome of </w:t>
-      </w:r>
-      <w:proofErr w:type="spellStart"/>
-      <w:r>
-        <w:t>RainTomorow</w:t>
-      </w:r>
-      <w:proofErr w:type="spellEnd"/>
-      <w:r>
-        <w:t xml:space="preserve"> is dependant on the combination of humidity, pressure, rainfall , wind and temperature</w:t>
-      </w:r>
-      <w:r>
-        <w:t xml:space="preserve">, the </w:t>
-      </w:r>
-      <w:proofErr w:type="spellStart"/>
-      <w:r>
-        <w:t>oucome</w:t>
-      </w:r>
-      <w:proofErr w:type="spellEnd"/>
-      <w:r>
-        <w:t xml:space="preserve"> is fully </w:t>
-      </w:r>
-      <w:proofErr w:type="spellStart"/>
-      <w:r>
-        <w:t>depfnant</w:t>
-      </w:r>
-      <w:proofErr w:type="spellEnd"/>
-      <w:r>
-        <w:t xml:space="preserve"> on multiple </w:t>
-      </w:r>
-      <w:proofErr w:type="spellStart"/>
-      <w:r>
-        <w:t>weathe</w:t>
-      </w:r>
-      <w:proofErr w:type="spellEnd"/>
-      <w:r>
-        <w:t xml:space="preserve"> </w:t>
-      </w:r>
-      <w:proofErr w:type="spellStart"/>
-      <w:r>
-        <w:t>cnditon</w:t>
-      </w:r>
-      <w:proofErr w:type="spellEnd"/>
-      <w:r>
-        <w:t xml:space="preserve"> as </w:t>
-      </w:r>
-      <w:proofErr w:type="spellStart"/>
-      <w:r>
-        <w:t>opped</w:t>
-      </w:r>
-      <w:proofErr w:type="spellEnd"/>
-      <w:r>
-        <w:t xml:space="preserve"> to being based of just one </w:t>
-      </w:r>
-      <w:proofErr w:type="spellStart"/>
-      <w:r>
-        <w:t>varible</w:t>
-      </w:r>
-      <w:proofErr w:type="spellEnd"/>
-      <w:r>
-        <w:t xml:space="preserve">. LCS can form rules based on combinations of </w:t>
-      </w:r>
-      <w:proofErr w:type="spellStart"/>
-      <w:r>
-        <w:t>costios</w:t>
-      </w:r>
-      <w:proofErr w:type="spellEnd"/>
-      <w:r>
-        <w:t xml:space="preserve"> so this fit our dataset well.</w:t>
-      </w:r>
-      <w:r>
-        <w:t xml:space="preserve"> Using </w:t>
-      </w:r>
-      <w:proofErr w:type="spellStart"/>
-      <w:r>
-        <w:t>condtion</w:t>
-      </w:r>
-      <w:proofErr w:type="spellEnd"/>
-      <w:r>
-        <w:t xml:space="preserve"> based classification rules the LCS can rep</w:t>
-      </w:r>
-      <w:r>
-        <w:t xml:space="preserve">resent these </w:t>
-      </w:r>
-      <w:proofErr w:type="spellStart"/>
-      <w:r>
-        <w:t>relatinsips</w:t>
-      </w:r>
-      <w:proofErr w:type="spellEnd"/>
-      <w:r>
-        <w:t xml:space="preserve"> where the rules associate combination of </w:t>
-      </w:r>
-      <w:proofErr w:type="spellStart"/>
-      <w:r>
-        <w:t>weathe</w:t>
-      </w:r>
-      <w:proofErr w:type="spellEnd"/>
-      <w:r>
-        <w:t xml:space="preserve"> </w:t>
-      </w:r>
-      <w:proofErr w:type="spellStart"/>
-      <w:r>
-        <w:t>contstion</w:t>
-      </w:r>
-      <w:proofErr w:type="spellEnd"/>
-      <w:r>
-        <w:t xml:space="preserve"> with </w:t>
-      </w:r>
-      <w:proofErr w:type="spellStart"/>
-      <w:r>
-        <w:t>RainTomorrow</w:t>
-      </w:r>
-      <w:proofErr w:type="spellEnd"/>
-      <w:r>
-        <w:t xml:space="preserve"> = Yes or No. This rule based </w:t>
-      </w:r>
-      <w:proofErr w:type="spellStart"/>
-      <w:r>
-        <w:t>stcure</w:t>
-      </w:r>
-      <w:proofErr w:type="spellEnd"/>
-      <w:r>
-        <w:t xml:space="preserve"> </w:t>
-      </w:r>
-      <w:proofErr w:type="spellStart"/>
-      <w:r>
-        <w:t>provies</w:t>
-      </w:r>
-      <w:proofErr w:type="spellEnd"/>
-      <w:r>
-        <w:t xml:space="preserve"> an </w:t>
-      </w:r>
-      <w:proofErr w:type="spellStart"/>
-      <w:r>
-        <w:t>interpretailit</w:t>
-      </w:r>
-      <w:proofErr w:type="spellEnd"/>
-      <w:r>
-        <w:t xml:space="preserve"> advantage, since individual rules or </w:t>
-      </w:r>
-      <w:proofErr w:type="spellStart"/>
-      <w:r>
-        <w:t>classfier</w:t>
-      </w:r>
-      <w:proofErr w:type="spellEnd"/>
-      <w:r>
-        <w:t xml:space="preserve"> can be inspected later</w:t>
-      </w:r>
-      <w:r>
-        <w:t>.</w:t>
+        <w:ind w:left="375" w:hanging="375"/>
+        <w:rPr>
+          <w:rFonts w:asciiTheme="minorHAnsi" w:hAnsiTheme="minorHAnsi"/>
+        </w:rPr>
+      </w:pPr>
+      <w:r>
+        <w:rPr>
+          <w:rFonts w:asciiTheme="minorHAnsi" w:hAnsiTheme="minorHAnsi"/>
+        </w:rPr>
+        <w:t>sutibality for an lcs based solution</w:t>
+      </w:r>
+    </w:p>
+    <w:p>
+      <w:pPr>
+        <w:pStyle w:val="NormalWeb"/>
+        <w:rPr>
+          <w:rFonts w:asciiTheme="minorHAnsi" w:hAnsiTheme="minorHAnsi"/>
+        </w:rPr>
+      </w:pPr>
+      <w:r>
+        <w:rPr>
+          <w:rFonts w:asciiTheme="minorHAnsi" w:hAnsiTheme="minorHAnsi"/>
+        </w:rPr>
+        <w:t>As mentioned before the rainfall prediction problem was suitable for an LCS approach and was approved by lecturer because it was a supervised classification problem due it having two classes: Yes/No. The outcome of RainTomorrow is dependent on the combination of humidity, pressure, rainfall , wind and temperature, the outcome is fully dependent on multiple weather conditions as opposed to being based of just one variable. LCS can form rules based on combinations of conditions so this fit our dataset well. Using condition based classification rules the LCS can represent these relationships where the rules associate combination of weather conditions with RainTomorrow = Yes or No. This rule based structure provides an interpretability advantage, since individual rules or classifier can be inspected later.</w:t>
       </w:r>
     </w:p>
     <w:p>
       <w:pPr>
         <w:pStyle w:val="Heading1"/>
-      </w:pPr>
-      <w:r>
+        <w:rPr>
+          <w:rFonts w:asciiTheme="minorHAnsi" w:hAnsiTheme="minorHAnsi"/>
+        </w:rPr>
+      </w:pPr>
+    </w:p>
+    <w:p>
+      <w:pPr>
+        <w:pStyle w:val="Heading1"/>
+        <w:rPr>
+          <w:rFonts w:asciiTheme="minorHAnsi" w:eastAsia="Times New Roman" w:hAnsiTheme="minorHAnsi" w:cs="Times New Roman"/>
+          <w:kern w:val="0"/>
+          <w:lang w:eastAsia="en-NZ"/>
+          <w14:ligatures w14:val="none"/>
+        </w:rPr>
+      </w:pPr>
+      <w:r>
+        <w:rPr>
+          <w:rFonts w:asciiTheme="minorHAnsi" w:eastAsia="Times New Roman" w:hAnsiTheme="minorHAnsi" w:cs="Times New Roman"/>
+          <w:kern w:val="0"/>
+          <w:lang w:eastAsia="en-NZ"/>
+          <w14:ligatures w14:val="none"/>
+        </w:rPr>
         <w:t>Task 2 : Original LCS System</w:t>
       </w:r>
     </w:p>
     <w:p>
       <w:pPr>
         <w:pStyle w:val="Heading2"/>
-      </w:pPr>
-      <w:r>
+        <w:rPr>
+          <w:rFonts w:asciiTheme="minorHAnsi" w:eastAsia="Times New Roman" w:hAnsiTheme="minorHAnsi"/>
+        </w:rPr>
+      </w:pPr>
+      <w:r>
+        <w:rPr>
+          <w:rFonts w:asciiTheme="minorHAnsi" w:eastAsia="Times New Roman" w:hAnsiTheme="minorHAnsi"/>
+        </w:rPr>
         <w:t>2.1 baseline lcs setup</w:t>
       </w:r>
     </w:p>
-    <w:p/>
+    <w:p>
+      <w:pPr>
+        <w:pStyle w:val="NormalWeb"/>
+        <w:rPr>
+          <w:rFonts w:asciiTheme="minorHAnsi" w:hAnsiTheme="minorHAnsi"/>
+        </w:rPr>
+      </w:pPr>
+      <w:r>
+        <w:rPr>
+          <w:rFonts w:asciiTheme="minorHAnsi" w:hAnsiTheme="minorHAnsi"/>
+        </w:rPr>
+        <w:t>To establish the original LCS Baseline, we applied the original eLCS model to the WeatherAUS we got from part 1 of the project. We used the target variable , RainTomorrow for the prediction outcome. We ran the original eLCS model to establish the starting performance before handling the later preprocessing, class imbalance and eLCS improvements. The eLCS implementation itself was left unmodified and since the WeatherAUS dataset cannot be directly used by the model to minimal compatibility processing was applied.</w:t>
+      </w:r>
+    </w:p>
+    <w:p>
+      <w:pPr>
+        <w:pStyle w:val="NormalWeb"/>
+        <w:rPr>
+          <w:rFonts w:asciiTheme="minorHAnsi" w:hAnsiTheme="minorHAnsi"/>
+        </w:rPr>
+      </w:pPr>
+      <w:r>
+        <w:rPr>
+          <w:rFonts w:asciiTheme="minorHAnsi" w:hAnsiTheme="minorHAnsi"/>
+        </w:rPr>
+        <w:t xml:space="preserve">The minimal compatibility processing was carried out by , removing the rows missing from RainTomorrow, converting the categorical columns of yes/no to numerical 1/0, removing the date variable and encoding the categorical predictors. This ensured that the raw data was usable by the eLCS without introducing later improvement. After removing the missing values in the target variable because the target label was unknown the dataset reduced from 145460 to 142193 records. As mentioned above the categorical variables were encoded numerically so that the eLCS processing could take </w:t>
+      </w:r>
+      <w:r>
+        <w:rPr>
+          <w:rFonts w:asciiTheme="minorHAnsi" w:hAnsiTheme="minorHAnsi"/>
+        </w:rPr>
+        <w:lastRenderedPageBreak/>
+        <w:t>place. Class balancing , feature selection , sine/cosine wind encoding or any tuned change the eLCS was not done yet.</w:t>
+      </w:r>
+    </w:p>
+    <w:p>
+      <w:pPr>
+        <w:pStyle w:val="NormalWeb"/>
+        <w:rPr>
+          <w:rFonts w:asciiTheme="minorHAnsi" w:hAnsiTheme="minorHAnsi"/>
+        </w:rPr>
+      </w:pPr>
+      <w:r>
+        <w:rPr>
+          <w:rFonts w:asciiTheme="minorHAnsi" w:hAnsiTheme="minorHAnsi"/>
+        </w:rPr>
+        <w:t>After the minimal processing took place we were left with 142193 records and 21 predictor variables, and RainTomorrow still as the target variable. We then made use of the 80/20 stratified split to divide the dataset, which then resulted in 113,754 training records and 28,43 testing records. We used stratification because the target variable RainTomorrow had an imbalanced class distribution so using the stratification kept the class proportion more similar and made the split more representative of both rain and no rain proportion in both subsets. A random state = 42 for reproducibility and consistency in later experiments.</w:t>
+      </w:r>
+    </w:p>
+    <w:p>
+      <w:pPr>
+        <w:pStyle w:val="NormalWeb"/>
+        <w:rPr>
+          <w:rFonts w:asciiTheme="minorHAnsi" w:hAnsiTheme="minorHAnsi"/>
+        </w:rPr>
+      </w:pPr>
+      <w:r>
+        <w:rPr>
+          <w:rFonts w:asciiTheme="minorHAnsi" w:hAnsiTheme="minorHAnsi"/>
+        </w:rPr>
+        <w:t>We Trained the baseline eLCS model using 113,754 learning iteration and population size of N=7000. We set the learning iterations to match the number of train observations, this ensured that each training records could contribute to the learning process across the full run. N, the population size parameter was used to control the maximum classifier population size. The final eLCS baseline was configured to the settings mentioned above to ensure that later eLCS runs could be compared in later tasks such as Task 4 and Task 6.</w:t>
+      </w:r>
+    </w:p>
     <w:p>
       <w:pPr>
         <w:pStyle w:val="Heading2"/>
-      </w:pPr>
-      <w:r>
+        <w:rPr>
+          <w:rFonts w:asciiTheme="minorHAnsi" w:eastAsia="Times New Roman" w:hAnsiTheme="minorHAnsi"/>
+        </w:rPr>
+      </w:pPr>
+      <w:r>
+        <w:rPr>
+          <w:rFonts w:asciiTheme="minorHAnsi" w:eastAsia="Times New Roman" w:hAnsiTheme="minorHAnsi"/>
+        </w:rPr>
         <w:t>2.2 baseline performance results</w:t>
       </w:r>
     </w:p>
-    <w:p/>
+    <w:p>
+      <w:pPr>
+        <w:pStyle w:val="NormalWeb"/>
+        <w:rPr>
+          <w:rFonts w:asciiTheme="minorHAnsi" w:hAnsiTheme="minorHAnsi"/>
+        </w:rPr>
+      </w:pPr>
+      <w:r>
+        <w:rPr>
+          <w:rFonts w:asciiTheme="minorHAnsi" w:hAnsiTheme="minorHAnsi"/>
+        </w:rPr>
+        <w:t>The original eLCS baseline we used achieved an overall accuracy of 82.87% and a balanced accuracy of 63.57%. In terms of the rain class the model achieved a precision of 0.85, recall of 0.29, and an F1 score of 0.43. At first glance even the thought the overall accuracy was relatively high the rain class recall was much lower. This showed us that the model struggled to identify actual rainy days. Accuracy alone was not reliable since it made the baseline look better than it actually was. The confusion matrix showed us that 21.745 true negatives so no rain observations , and true positives were 1822 meaning 1822 rain observations. These were predicted correctly while the 4553 actual rain observation which were false negatives were incorrectly classified as no rain. The results highlighted the issues that the baseline eLCS was more effective to predict the majority no-rain class compared to the minority rain class, this provided us with a reason to investigate the class imbalance handling an make improvements to the minority class prediction handling we were currently doing.</w:t>
+      </w:r>
+    </w:p>
     <w:p>
       <w:pPr>
         <w:pStyle w:val="Heading1"/>
-      </w:pPr>
-      <w:r>
-        <w:t xml:space="preserve">Task 3: Data preprocessing and feature </w:t>
-      </w:r>
-      <w:proofErr w:type="spellStart"/>
-      <w:r>
-        <w:t>engienrring</w:t>
-      </w:r>
-      <w:proofErr w:type="spellEnd"/>
+        <w:rPr>
+          <w:rFonts w:asciiTheme="minorHAnsi" w:eastAsia="Times New Roman" w:hAnsiTheme="minorHAnsi"/>
+        </w:rPr>
+      </w:pPr>
+      <w:r>
+        <w:rPr>
+          <w:rFonts w:asciiTheme="minorHAnsi" w:eastAsia="Times New Roman" w:hAnsiTheme="minorHAnsi"/>
+        </w:rPr>
+        <w:t>Task 3: Data preprocessing and feature engineering</w:t>
+      </w:r>
     </w:p>
     <w:p>
       <w:pPr>
         <w:pStyle w:val="Heading2"/>
-      </w:pPr>
-      <w:r>
-        <w:t xml:space="preserve">3.1 data </w:t>
-      </w:r>
-      <w:proofErr w:type="spellStart"/>
-      <w:r>
-        <w:t>preprocssesing</w:t>
-      </w:r>
-      <w:proofErr w:type="spellEnd"/>
+        <w:rPr>
+          <w:rFonts w:asciiTheme="minorHAnsi" w:eastAsia="Times New Roman" w:hAnsiTheme="minorHAnsi"/>
+        </w:rPr>
+      </w:pPr>
+      <w:r>
+        <w:rPr>
+          <w:rFonts w:asciiTheme="minorHAnsi" w:eastAsia="Times New Roman" w:hAnsiTheme="minorHAnsi"/>
+        </w:rPr>
+        <w:t>3.1 data preprocessing</w:t>
+      </w:r>
+    </w:p>
+    <w:p>
+      <w:pPr>
+        <w:pStyle w:val="NormalWeb"/>
+        <w:rPr>
+          <w:rFonts w:asciiTheme="minorHAnsi" w:hAnsiTheme="minorHAnsi"/>
+        </w:rPr>
+      </w:pPr>
+      <w:r>
+        <w:rPr>
+          <w:rFonts w:asciiTheme="minorHAnsi" w:hAnsiTheme="minorHAnsi"/>
+        </w:rPr>
+        <w:t xml:space="preserve">Before we could start modelling the dataset needed preprocessing to address the missing values, invalid values, inconsistent categorical values , outlier and other problems. Missing values present in numerical features were handled using median imputation as mentions before , missing categorical values in features such as WindGustDir, WindDir9am, RainToday were all replaced using the mode. Missing </w:t>
+      </w:r>
+      <w:r>
+        <w:rPr>
+          <w:rFonts w:asciiTheme="minorHAnsi" w:hAnsiTheme="minorHAnsi"/>
+        </w:rPr>
+        <w:lastRenderedPageBreak/>
+        <w:t>records in RainTomorrow were removed as opposed to being imputed because the target is unknown, so inventing it would give the model false labels.</w:t>
+      </w:r>
+    </w:p>
+    <w:p>
+      <w:pPr>
+        <w:pStyle w:val="NormalWeb"/>
+        <w:rPr>
+          <w:rFonts w:asciiTheme="minorHAnsi" w:hAnsiTheme="minorHAnsi"/>
+        </w:rPr>
+      </w:pPr>
+      <w:r>
+        <w:rPr>
+          <w:rFonts w:asciiTheme="minorHAnsi" w:hAnsiTheme="minorHAnsi"/>
+        </w:rPr>
+        <w:t>The dataset was also checked for duplicate records, invalid values, and inconsistent categorical labels. Using duplicate checking we were able to identify zero duplicate rows, therefore no duplicate removal was required. Range checks were performed on features such as cloud cover variables, where invalid or unusual values were identified. We then checked the categorical values as mentioned in task 1. Any extreme observation that were found were not automatically removed because extreme weather is plausible and cannot be automatically counted as an error. One such value identified was Williamtown which had Evaporation = 145, so after investigation it was replaced using an appropriate median value. Any other extreme values that we deemed plausible and were consistent with the possible weather observations were retained in the dataset.</w:t>
+      </w:r>
+    </w:p>
+    <w:p>
+      <w:pPr>
+        <w:pStyle w:val="NormalWeb"/>
+        <w:rPr>
+          <w:rFonts w:asciiTheme="minorHAnsi" w:hAnsiTheme="minorHAnsi"/>
+        </w:rPr>
+      </w:pPr>
+      <w:r>
+        <w:rPr>
+          <w:rFonts w:asciiTheme="minorHAnsi" w:hAnsiTheme="minorHAnsi"/>
+        </w:rPr>
+        <w:t>(Coding part – revise the median/mode statistics then applied to the test set to avoid data leakage).</w:t>
+      </w:r>
     </w:p>
     <w:p>
       <w:pPr>
         <w:pStyle w:val="Heading2"/>
-      </w:pPr>
-      <w:r>
-        <w:t xml:space="preserve">3.2 feature </w:t>
-      </w:r>
-      <w:proofErr w:type="spellStart"/>
-      <w:r>
-        <w:t>enginerrin</w:t>
-      </w:r>
-      <w:proofErr w:type="spellEnd"/>
-      <w:r>
-        <w:t xml:space="preserve"> and selection</w:t>
+        <w:rPr>
+          <w:rFonts w:asciiTheme="minorHAnsi" w:eastAsia="Times New Roman" w:hAnsiTheme="minorHAnsi"/>
+        </w:rPr>
+      </w:pPr>
+      <w:r>
+        <w:rPr>
+          <w:rFonts w:asciiTheme="minorHAnsi" w:eastAsia="Times New Roman" w:hAnsiTheme="minorHAnsi"/>
+        </w:rPr>
+        <w:t>3.2 feature engineering and selection</w:t>
+      </w:r>
+    </w:p>
+    <w:p>
+      <w:pPr>
+        <w:pStyle w:val="NormalWeb"/>
+        <w:rPr>
+          <w:rFonts w:asciiTheme="minorHAnsi" w:hAnsiTheme="minorHAnsi"/>
+        </w:rPr>
+      </w:pPr>
+      <w:r>
+        <w:rPr>
+          <w:rFonts w:asciiTheme="minorHAnsi" w:hAnsiTheme="minorHAnsi"/>
+        </w:rPr>
+        <w:t>Our original recorded wind direction features were recorded as categorical compass directions, including values such as N, NNW, se etc. so we converted these direction into compass angle.degrees and then transformed them using the sine and cosine methods. Since wind direction is circular the ordinary category numbering would have not preserved that. So the resulting features allowed the model to use wind direction in numerical and model compatible form while maintaining the directional relationship.</w:t>
+      </w:r>
+    </w:p>
+    <w:p>
+      <w:pPr>
+        <w:pStyle w:val="NormalWeb"/>
+        <w:rPr>
+          <w:rFonts w:asciiTheme="minorHAnsi" w:hAnsiTheme="minorHAnsi"/>
+        </w:rPr>
+      </w:pPr>
+      <w:r>
+        <w:rPr>
+          <w:rFonts w:asciiTheme="minorHAnsi" w:hAnsiTheme="minorHAnsi"/>
+        </w:rPr>
+        <w:t>For the location feature one-hot encoding was used to transform. One-hot encoding was preferred because since locations have no meaningful numerical ranking , assigning arbitrary number could imply a fake distance. Other binary categorical variables such as RainToday were converted or transformed into numerical binary representation. Finally these transformation converted the remaining categorical information into numerical inputs suitable for eLCS/conventional models.</w:t>
+      </w:r>
+    </w:p>
+    <w:p>
+      <w:pPr>
+        <w:pStyle w:val="NormalWeb"/>
+        <w:rPr>
+          <w:rFonts w:asciiTheme="minorHAnsi" w:hAnsiTheme="minorHAnsi"/>
+        </w:rPr>
+      </w:pPr>
+      <w:r>
+        <w:rPr>
+          <w:rFonts w:asciiTheme="minorHAnsi" w:hAnsiTheme="minorHAnsi"/>
+        </w:rPr>
+        <w:t>Using correlation analysis and distribution and outlier investigation we examined the feature relationships that we found in phase 1. There were some features such as Humidity3pm, sunshine, RainToday , with showed useful relationships with RainTomorrow. Despite this the features were not removed because of the weak individual correlation and also even if the single-feature relationship is weaker it is still useful for the LCS rules. Therefore we kept the most relevant cleaner weather variables.</w:t>
+      </w:r>
+    </w:p>
+    <w:p>
+      <w:pPr>
+        <w:pStyle w:val="NormalWeb"/>
+        <w:rPr>
+          <w:rFonts w:asciiTheme="minorHAnsi" w:hAnsiTheme="minorHAnsi"/>
+        </w:rPr>
+      </w:pPr>
+      <w:r>
+        <w:rPr>
+          <w:rFonts w:asciiTheme="minorHAnsi" w:hAnsiTheme="minorHAnsi"/>
+        </w:rPr>
+        <w:t>[CODING PART – add any final feature-selection method if one is later implemented.]</w:t>
+      </w:r>
+    </w:p>
+    <w:p>
+      <w:pPr>
+        <w:pStyle w:val="NormalWeb"/>
+        <w:rPr>
+          <w:rFonts w:asciiTheme="minorHAnsi" w:hAnsiTheme="minorHAnsi"/>
+        </w:rPr>
+      </w:pPr>
+      <w:r>
+        <w:rPr>
+          <w:rFonts w:asciiTheme="minorHAnsi" w:hAnsiTheme="minorHAnsi"/>
+        </w:rPr>
+        <w:t>Initial attempt data attempt sections</w:t>
       </w:r>
     </w:p>
     <w:p>
       <w:pPr>
         <w:pStyle w:val="Heading2"/>
-      </w:pPr>
-      <w:r>
-        <w:t xml:space="preserve">3.3 final </w:t>
-      </w:r>
-      <w:proofErr w:type="spellStart"/>
-      <w:r>
-        <w:t>processwd</w:t>
-      </w:r>
-      <w:proofErr w:type="spellEnd"/>
-      <w:r>
-        <w:t xml:space="preserve"> dataset</w:t>
-      </w:r>
-    </w:p>
-    <w:p/>
+        <w:rPr>
+          <w:rFonts w:asciiTheme="minorHAnsi" w:eastAsia="Times New Roman" w:hAnsiTheme="minorHAnsi"/>
+        </w:rPr>
+      </w:pPr>
+      <w:r>
+        <w:rPr>
+          <w:rFonts w:asciiTheme="minorHAnsi" w:eastAsia="Times New Roman" w:hAnsiTheme="minorHAnsi"/>
+        </w:rPr>
+        <w:lastRenderedPageBreak/>
+        <w:t>3.3 final processed dataset</w:t>
+      </w:r>
+    </w:p>
+    <w:p>
+      <w:pPr>
+        <w:pStyle w:val="NormalWeb"/>
+        <w:rPr>
+          <w:rFonts w:asciiTheme="minorHAnsi" w:hAnsiTheme="minorHAnsi"/>
+        </w:rPr>
+      </w:pPr>
+      <w:r>
+        <w:rPr>
+          <w:rFonts w:asciiTheme="minorHAnsi" w:hAnsiTheme="minorHAnsi"/>
+        </w:rPr>
+        <w:t>After cleaning and transformation , the processed dataset contains 142,13 rows and approximately 76 columns in the full encoded dataset. Due to one hot encoding there was a significant increase in the number of columns, particularly in the location variable. Numerical features were found on the processed dataset which then made it suitable for the eLCS and the implementing other conventional ML models. To later investigate if reducing feature space would make the eLCS more manageable and efficient a more compact processed dataset was also produced.</w:t>
+      </w:r>
+    </w:p>
     <w:p>
       <w:pPr>
         <w:pStyle w:val="Heading1"/>
-      </w:pPr>
-      <w:r>
+        <w:rPr>
+          <w:rFonts w:asciiTheme="minorHAnsi" w:eastAsia="Times New Roman" w:hAnsiTheme="minorHAnsi"/>
+        </w:rPr>
+      </w:pPr>
+      <w:r>
+        <w:rPr>
+          <w:rFonts w:asciiTheme="minorHAnsi" w:eastAsia="Times New Roman" w:hAnsiTheme="minorHAnsi"/>
+        </w:rPr>
+        <w:t>Task 4: improved lcs based system</w:t>
+      </w:r>
+    </w:p>
+    <w:p>
+      <w:pPr>
+        <w:pStyle w:val="Heading2"/>
+        <w:rPr>
+          <w:rFonts w:asciiTheme="minorHAnsi" w:eastAsia="Times New Roman" w:hAnsiTheme="minorHAnsi"/>
+        </w:rPr>
+      </w:pPr>
+      <w:r>
+        <w:rPr>
+          <w:rFonts w:asciiTheme="minorHAnsi" w:eastAsia="Times New Roman" w:hAnsiTheme="minorHAnsi"/>
+        </w:rPr>
+        <w:t>4.1 proposed lcs improvements</w:t>
+      </w:r>
+    </w:p>
+    <w:p>
+      <w:pPr>
+        <w:pStyle w:val="NormalWeb"/>
+        <w:rPr>
+          <w:rFonts w:asciiTheme="minorHAnsi" w:hAnsiTheme="minorHAnsi"/>
+        </w:rPr>
+      </w:pPr>
+      <w:r>
+        <w:rPr>
+          <w:rFonts w:asciiTheme="minorHAnsi" w:hAnsiTheme="minorHAnsi"/>
+        </w:rPr>
+        <w:t>The main problem that was identified in the baseline eLCS was the poor detection of the minority rain class, despite achieving an overall accuracy of 82.87%. As mentioned before this were reflected in the rain class recall of 0.29 and the f1 score of 0.43, which proved that many actual rainy days were missing and overall accuracy wasn’t an accurate representation of the minority class performance. The the Target variable RainTomorrow had a significant class distribution issue , it was imbalanced with around 110k no rain compared to 32k rain observations. So the proposed improvements to improve this imbalance are improving the rain class detecting rather than just taking overall accuracy into account. The aim of the improved system was to therefore increase rain recall, and rain F1, while maintaining reasonable and balanced overall accuracy</w:t>
+      </w:r>
+    </w:p>
+    <w:p>
+      <w:pPr>
+        <w:pStyle w:val="Heading2"/>
+        <w:rPr>
+          <w:rFonts w:asciiTheme="minorHAnsi" w:eastAsia="Times New Roman" w:hAnsiTheme="minorHAnsi"/>
+        </w:rPr>
+      </w:pPr>
+      <w:r>
+        <w:rPr>
+          <w:rFonts w:asciiTheme="minorHAnsi" w:eastAsia="Times New Roman" w:hAnsiTheme="minorHAnsi"/>
+        </w:rPr>
+        <w:t>4.2 improved system implementation</w:t>
+      </w:r>
+    </w:p>
+    <w:p>
+      <w:pPr>
+        <w:pStyle w:val="NormalWeb"/>
+        <w:rPr>
+          <w:rFonts w:asciiTheme="minorHAnsi" w:hAnsiTheme="minorHAnsi"/>
+        </w:rPr>
+      </w:pPr>
+      <w:r>
+        <w:rPr>
+          <w:rFonts w:asciiTheme="minorHAnsi" w:hAnsiTheme="minorHAnsi"/>
+        </w:rPr>
+        <w:t>After the proposed changes, the final improved eLCS was trained using a total of 30k training observations which were taken from the processed dataset. The observations came from training the partition not the test set. The training subset on the other hand contained 20k no-rain observations and 10k rain observation with a producing class ratio of 2:1. The majority no rain class was randomly undersampled as opposed to oversampling since oversampling would increase the training size while also making the same minority observations. The test set was left unchanged because balancing it would artificially change the evaluation problem, and performance should be measured against naturally imbalanced unseen data. Therefore the modified class distribution only affected the training while the evaluation represented the original class distribution.</w:t>
+      </w:r>
+    </w:p>
+    <w:p>
+      <w:pPr>
+        <w:pStyle w:val="NormalWeb"/>
+        <w:rPr>
+          <w:rFonts w:asciiTheme="minorHAnsi" w:hAnsiTheme="minorHAnsi"/>
+        </w:rPr>
+      </w:pPr>
+      <w:r>
+        <w:rPr>
+          <w:rFonts w:asciiTheme="minorHAnsi" w:hAnsiTheme="minorHAnsi"/>
+        </w:rPr>
+        <w:t xml:space="preserve">The improved eLCS was configured with a population size of N= 10k, the N limits how many classifier rules the eLCS can maintain however our baseline population was 7k. Increasing the model from 7k to 10k increased it capacity to retain the rules, especially after reducing the majority class dominance through sampling. Despite this it does not give guaranteed better performance but it does give a higher capacity. The number of </w:t>
+      </w:r>
+      <w:r>
+        <w:rPr>
+          <w:rFonts w:asciiTheme="minorHAnsi" w:hAnsiTheme="minorHAnsi"/>
+        </w:rPr>
         <w:lastRenderedPageBreak/>
-        <w:t>Task 4: improved lcs based system</w:t>
+        <w:t>learning iteration = 30k, so there were 30k records in the training subset, this kept the training effort proportional to the amount of data we used. To avoid unnecessarily long runs during tuning, which did take up a lot of our time and caused a lot of issues we used a smaller sample size of 10k iteration development run for the final system. This maintained a consistent training approach while avoiding excessive computation cost as well. A random state of 42 was retained so that the sampled training subset could be reproduced and the comparisons would appear more consistent.</w:t>
       </w:r>
     </w:p>
     <w:p>
       <w:pPr>
         <w:pStyle w:val="Heading2"/>
-      </w:pPr>
-      <w:r>
-        <w:t>4.1 proposed lcs improvements</w:t>
-      </w:r>
-    </w:p>
-    <w:p>
-      <w:pPr>
-        <w:pStyle w:val="Heading2"/>
-      </w:pPr>
-      <w:r>
-        <w:t>4.2 improved system implantation</w:t>
-      </w:r>
-    </w:p>
-    <w:p>
-      <w:pPr>
-        <w:pStyle w:val="Heading2"/>
-      </w:pPr>
-      <w:r>
-        <w:t xml:space="preserve">4.3 </w:t>
-      </w:r>
-      <w:proofErr w:type="spellStart"/>
-      <w:r>
-        <w:t>comaprison</w:t>
-      </w:r>
-      <w:proofErr w:type="spellEnd"/>
-      <w:r>
-        <w:t xml:space="preserve"> with the </w:t>
-      </w:r>
-      <w:proofErr w:type="spellStart"/>
-      <w:r>
-        <w:t>basleine</w:t>
-      </w:r>
-      <w:proofErr w:type="spellEnd"/>
-      <w:r>
-        <w:t xml:space="preserve"> lcs</w:t>
-      </w:r>
-    </w:p>
-    <w:p/>
+        <w:rPr>
+          <w:rFonts w:asciiTheme="minorHAnsi" w:eastAsia="Times New Roman" w:hAnsiTheme="minorHAnsi"/>
+        </w:rPr>
+      </w:pPr>
+      <w:r>
+        <w:rPr>
+          <w:rFonts w:asciiTheme="minorHAnsi" w:eastAsia="Times New Roman" w:hAnsiTheme="minorHAnsi"/>
+        </w:rPr>
+        <w:t>4.3 comparison with the baseline lcs</w:t>
+      </w:r>
+    </w:p>
+    <w:p>
+      <w:pPr>
+        <w:pStyle w:val="NormalWeb"/>
+        <w:rPr>
+          <w:rFonts w:asciiTheme="minorHAnsi" w:hAnsiTheme="minorHAnsi"/>
+        </w:rPr>
+      </w:pPr>
+      <w:r>
+        <w:rPr>
+          <w:rFonts w:asciiTheme="minorHAnsi" w:hAnsiTheme="minorHAnsi"/>
+        </w:rPr>
+        <w:t>The final improved system was then compared with the original baseline eLCS that was trained on the raw processed WeatherAUS Dataset. This was done to evaluate whether the proposed changes had improved the eLCS performance. The original baseline achieved an accuracy of 82.87% and 63.57% accuracy, and the rain class recall and F1 score were 0.2 and 0.43 respectively. An intermediate eLCS was also evaluated on the cleaned or preprocessed dataset to find out whether preprocessing alone could address the weakness. Despite this the preprocessed eLCS produced a rain recall of approximately 0.20 and an F1 score of approximately 0.33 meaning that preprocessing alone did not fix the minority rain detection so we later turned to balancing and tuning.</w:t>
+      </w:r>
+    </w:p>
+    <w:p>
+      <w:pPr>
+        <w:pStyle w:val="NormalWeb"/>
+        <w:rPr>
+          <w:rFonts w:asciiTheme="minorHAnsi" w:hAnsiTheme="minorHAnsi"/>
+        </w:rPr>
+      </w:pPr>
+      <w:r>
+        <w:rPr>
+          <w:rFonts w:asciiTheme="minorHAnsi" w:hAnsiTheme="minorHAnsi"/>
+        </w:rPr>
+        <w:t>After partial class balancing and eLCS parameter tuning were introduced the final system achieved an accuracy of 84.01% and 70.66% balanced accuracy which was a significant increase. This increase in balanced accuracy was important because it meant that RainTomorrow the target variable performance across both classes would be reflected more evenly. In terms of the minority rain class, the recall increased from 0.29 in the original baseline to 0.46 in the improved system, while the F1 score increased from 0.43 to 0.57 meaning that in the recall more rainy days were detected and in the F1 there was a better overall balance between precision and recall. This reduced the number of false negatives that were initially shown to 3413 from the initial number of 4553. This meant that the improved system missed 1140 fewer rain observations which is a significant and important change in train our model. In terms of the trade off the rain precision decreased from 0.85 to 0.72, while the false positives increased from 319 to 1135. This showed us that even though a higher prediction of rain was being carried out it came at the cost of more incorrect rain predictions. I conclusion the final improved configuration provided stronger minority class detecting , better balance between the two classes and higher balanced accuracy compared to the baseline as opposed to simply maximising precision of ordinary accuracy.</w:t>
+      </w:r>
+    </w:p>
+    <w:p>
+      <w:r>
+        <w:rPr>
+          <w:rFonts w:eastAsia="Times New Roman" w:cs="Times New Roman"/>
+          <w:kern w:val="0"/>
+          <w:lang w:eastAsia="en-NZ"/>
+          <w14:ligatures w14:val="none"/>
+        </w:rPr>
+        <w:t>Add table for three of the following original eLCS , preprocessed eLCS and final improved eLCS.</w:t>
+      </w:r>
+    </w:p>
     <w:sectPr>
       <w:pgSz w:w="11906" w:h="16838"/>
       <w:pgMar w:top="1440" w:right="1440" w:bottom="1440" w:left="1440" w:header="708" w:footer="708" w:gutter="0"/>
@@ -1646,6 +1282,7 @@
   <w:style w:type="paragraph" w:default="1" w:styleId="Normal">
     <w:name w:val="Normal"/>
     <w:qFormat/>
+    <w:rsid w:val="00780B58"/>
   </w:style>
   <w:style w:type="paragraph" w:styleId="Heading1">
     <w:name w:val="heading 1"/>
@@ -1848,6 +1485,7 @@
   <w:style w:type="character" w:default="1" w:styleId="DefaultParagraphFont">
     <w:name w:val="Default Paragraph Font"/>
     <w:uiPriority w:val="1"/>
+    <w:semiHidden/>
     <w:unhideWhenUsed/>
   </w:style>
   <w:style w:type="table" w:default="1" w:styleId="TableNormal">
@@ -2158,6 +1796,23 @@
       <w:smallCaps/>
       <w:color w:val="0F4761" w:themeColor="accent1" w:themeShade="BF"/>
       <w:spacing w:val="5"/>
+    </w:rPr>
+  </w:style>
+  <w:style w:type="paragraph" w:styleId="NormalWeb">
+    <w:name w:val="Normal (Web)"/>
+    <w:basedOn w:val="Normal"/>
+    <w:uiPriority w:val="99"/>
+    <w:semiHidden/>
+    <w:unhideWhenUsed/>
+    <w:rsid w:val="00780B58"/>
+    <w:pPr>
+      <w:spacing w:before="100" w:beforeAutospacing="1" w:after="100" w:afterAutospacing="1" w:line="240" w:lineRule="auto"/>
+    </w:pPr>
+    <w:rPr>
+      <w:rFonts w:ascii="Times New Roman" w:eastAsia="Times New Roman" w:hAnsi="Times New Roman" w:cs="Times New Roman"/>
+      <w:kern w:val="0"/>
+      <w:lang w:eastAsia="en-NZ"/>
+      <w14:ligatures w14:val="none"/>
     </w:rPr>
   </w:style>
 </w:styles>

</xml_diff>

<commit_message>
edited the reprt still wokrng on it tho ,
as the code has changed the reprt has aso needed tob e updated
</commit_message>
<xml_diff>
--- a/Final Progress Report.docx
+++ b/Final Progress Report.docx
@@ -5,636 +5,386 @@
     <w:p>
       <w:pPr>
         <w:pStyle w:val="Heading1"/>
-        <w:rPr>
-          <w:rFonts w:asciiTheme="minorHAnsi" w:hAnsiTheme="minorHAnsi"/>
-        </w:rPr>
-      </w:pPr>
-      <w:r>
-        <w:rPr>
-          <w:rFonts w:asciiTheme="minorHAnsi" w:hAnsiTheme="minorHAnsi"/>
-        </w:rPr>
+      </w:pPr>
+      <w:r>
         <w:t>Introduction</w:t>
       </w:r>
     </w:p>
     <w:p>
       <w:pPr>
         <w:pStyle w:val="Heading1"/>
-        <w:rPr>
-          <w:rFonts w:asciiTheme="minorHAnsi" w:hAnsiTheme="minorHAnsi"/>
-        </w:rPr>
-      </w:pPr>
-      <w:r>
-        <w:rPr>
-          <w:rFonts w:asciiTheme="minorHAnsi" w:hAnsiTheme="minorHAnsi"/>
-        </w:rPr>
+      </w:pPr>
+      <w:r>
         <w:t>Task 1: Project Phase 1 summary</w:t>
       </w:r>
     </w:p>
     <w:p>
       <w:pPr>
         <w:pStyle w:val="Heading2"/>
-        <w:numPr>
-          <w:ilvl w:val="1"/>
-          <w:numId w:val="2"/>
-        </w:numPr>
-        <w:ind w:left="375" w:hanging="375"/>
-        <w:rPr>
-          <w:rFonts w:asciiTheme="minorHAnsi" w:hAnsiTheme="minorHAnsi"/>
-        </w:rPr>
-      </w:pPr>
-      <w:r>
-        <w:rPr>
-          <w:rFonts w:asciiTheme="minorHAnsi" w:hAnsiTheme="minorHAnsi"/>
-        </w:rPr>
-        <w:t>problem and datset overview</w:t>
-      </w:r>
-    </w:p>
-    <w:p>
-      <w:pPr>
-        <w:pStyle w:val="NormalWeb"/>
-        <w:ind w:left="473"/>
-        <w:rPr>
-          <w:rFonts w:asciiTheme="minorHAnsi" w:hAnsiTheme="minorHAnsi"/>
-        </w:rPr>
-      </w:pPr>
-      <w:r>
-        <w:rPr>
-          <w:rFonts w:asciiTheme="minorHAnsi" w:hAnsiTheme="minorHAnsi"/>
-        </w:rPr>
+      </w:pPr>
+      <w:r>
+        <w:t>1.1 problem and datset overview</w:t>
+      </w:r>
+    </w:p>
+    <w:p>
+      <w:r>
         <w:t>The real world problem that was investigated in this project was using historical weather observation to predict next day rainfall in Australia. The predictive objective in out our project is to use the recorded weather conditions or features from the current observation to predict whether rainfall will occur the next day . The identified Target variables for this project were RainTomorrow, which records the next day rainfall outcome in the form of Yes or No. Since RainTomorrow contains two possible outcomes Yes and No, the prediction is therefore treated as a binary classification problem. Other weather variables were also used such as Cloud3pm, Sunshine, and Evaporation and more to determine the next day rainfall class.</w:t>
       </w:r>
     </w:p>
     <w:p>
-      <w:pPr>
-        <w:pStyle w:val="NormalWeb"/>
-        <w:ind w:left="473"/>
-        <w:rPr>
-          <w:rFonts w:asciiTheme="minorHAnsi" w:hAnsiTheme="minorHAnsi"/>
-        </w:rPr>
-      </w:pPr>
-      <w:r>
-        <w:rPr>
-          <w:rFonts w:asciiTheme="minorHAnsi" w:hAnsiTheme="minorHAnsi"/>
-        </w:rPr>
+      <w:r>
         <w:t>The dataset selected for this project was WeatherAUS, which contains the historical Australian weather observations. In regards to the dataset size the original dataset contained 145,460 records and 23 original variables. The data contained observations about weather conditions such as temperature, rainfall, evaporation, sunshine, wind, humidity, pressure, cloud cover in accordance with their location and date. The overall observations in the dataset were collected across multiple Australian locations for about 10 years. Therefore, the dataset was considered suitable for the prediction task because it contained both weather conditions and the RainTomorrow outcome, allowing the model to learn patterns between them.</w:t>
       </w:r>
     </w:p>
     <w:p>
       <w:pPr>
         <w:pStyle w:val="Heading2"/>
-        <w:numPr>
-          <w:ilvl w:val="1"/>
-          <w:numId w:val="2"/>
-        </w:numPr>
-        <w:ind w:left="375" w:hanging="375"/>
-        <w:rPr>
-          <w:rFonts w:asciiTheme="minorHAnsi" w:hAnsiTheme="minorHAnsi"/>
-        </w:rPr>
-      </w:pPr>
-      <w:r>
-        <w:rPr>
-          <w:rFonts w:asciiTheme="minorHAnsi" w:hAnsiTheme="minorHAnsi"/>
-        </w:rPr>
-        <w:t>phase 1 data quality summary</w:t>
-      </w:r>
-    </w:p>
-    <w:p>
-      <w:pPr>
-        <w:pStyle w:val="NormalWeb"/>
-        <w:ind w:left="473"/>
-        <w:rPr>
-          <w:rFonts w:asciiTheme="minorHAnsi" w:hAnsiTheme="minorHAnsi"/>
-        </w:rPr>
-      </w:pPr>
-      <w:r>
-        <w:rPr>
-          <w:rFonts w:asciiTheme="minorHAnsi" w:hAnsiTheme="minorHAnsi"/>
-        </w:rPr>
+      </w:pPr>
+      <w:r>
+        <w:t>1.2 phase 1 data quality summary</w:t>
+      </w:r>
+    </w:p>
+    <w:p>
+      <w:r>
         <w:t>IN phase 1 we identified several data quality issues from the original dataset such as missing values, invalid values, outliers, class imbalance and categorical consistency checks. The most significant issue we dealt with was missing values in features such as Sunshine, Evaporation, Cloud9am an Cloud3pm. The target variable also displayed a class imbalance with approximately around 110k No and 32k Yes, this would present as a problem for our phase 2 project . We also checked categorical variables for whitespace or spelling inconsistencies, with the whitespace being cleaned.</w:t>
       </w:r>
     </w:p>
     <w:p>
-      <w:pPr>
-        <w:pStyle w:val="NormalWeb"/>
-        <w:ind w:left="473"/>
-        <w:rPr>
-          <w:rFonts w:asciiTheme="minorHAnsi" w:hAnsiTheme="minorHAnsi"/>
-        </w:rPr>
-      </w:pPr>
-      <w:r>
-        <w:rPr>
-          <w:rFonts w:asciiTheme="minorHAnsi" w:hAnsiTheme="minorHAnsi"/>
-        </w:rPr>
-        <w:t xml:space="preserve">To address these issues found in phase 1 we applied missing value handling, category cleaning, invalid value checks, outlier investigations as well as target cleaning to prepare the dataset for modelling. The missing numerical values were handled using median imputation, since it would be less affected by extreme or </w:t>
-      </w:r>
-      <w:r>
-        <w:rPr>
-          <w:rFonts w:asciiTheme="minorHAnsi" w:hAnsiTheme="minorHAnsi"/>
-        </w:rPr>
-        <w:lastRenderedPageBreak/>
-        <w:t>skewed values. Meanwhile the missing categorical values were handled by applying mode imputation for categorical features. The records that had RainTomorrow missing were removed since we can’t train on an unknown class label. Any invalid or unusual values such as invalid cloud values were checked and investigated as opposed to being removed and a suspicious evaporation values was replaced. The categorical values were whitespace stripped to make sure that consistency was maintained. After the cleaning and transformation the dataset contained about 142,193 records and was compatible for phase 2 modelling.</w:t>
-      </w:r>
-    </w:p>
-    <w:p>
-      <w:pPr>
-        <w:pStyle w:val="Heading2"/>
-        <w:numPr>
-          <w:ilvl w:val="1"/>
-          <w:numId w:val="2"/>
-        </w:numPr>
-        <w:ind w:left="375" w:hanging="375"/>
-        <w:rPr>
-          <w:rFonts w:asciiTheme="minorHAnsi" w:hAnsiTheme="minorHAnsi"/>
-        </w:rPr>
-      </w:pPr>
-      <w:r>
-        <w:rPr>
-          <w:rFonts w:asciiTheme="minorHAnsi" w:hAnsiTheme="minorHAnsi"/>
-        </w:rPr>
-        <w:t>sutibality for an lcs based solution</w:t>
-      </w:r>
-    </w:p>
-    <w:p>
-      <w:pPr>
-        <w:pStyle w:val="NormalWeb"/>
-        <w:rPr>
-          <w:rFonts w:asciiTheme="minorHAnsi" w:hAnsiTheme="minorHAnsi"/>
-        </w:rPr>
-      </w:pPr>
-      <w:r>
-        <w:rPr>
-          <w:rFonts w:asciiTheme="minorHAnsi" w:hAnsiTheme="minorHAnsi"/>
-        </w:rPr>
+      <w:r>
+        <w:t>To address these issues found in phase 1 we applied missing value handling, category cleaning, invalid value checks, outlier investigations as well as target cleaning to prepare the dataset for modelling. The missing numerical values were handled using median imputation, since it would be less affected by extreme or skewed values. Meanwhile the missing categorical values were handled by applying mode imputation for categorical features. The records that had RainTomorrow missing were removed since we can’t train on an unknown class label. Any invalid or unusual values such as invalid cloud values were checked and investigated as opposed to being removed and a suspicious evaporation values was replaced. The categorical values were whitespace stripped to make sure that consistency was maintained. After the cleaning and transformation the dataset contained about 142,193 records and was compatible for phase 2 modelling.</w:t>
+      </w:r>
+    </w:p>
+    <w:p>
+      <w:pPr>
+        <w:pStyle w:val="Heading2"/>
+      </w:pPr>
+      <w:r>
+        <w:t>1.3 sutibality for an lcs based solution</w:t>
+      </w:r>
+    </w:p>
+    <w:p>
+      <w:r>
         <w:t>As mentioned before the rainfall prediction problem was suitable for an LCS approach and was approved by lecturer because it was a supervised classification problem due it having two classes: Yes/No. The outcome of RainTomorrow is dependent on the combination of humidity, pressure, rainfall , wind and temperature, the outcome is fully dependent on multiple weather conditions as opposed to being based of just one variable. LCS can form rules based on combinations of conditions so this fit our dataset well. Using condition based classification rules the LCS can represent these relationships where the rules associate combination of weather conditions with RainTomorrow = Yes or No. This rule based structure provides an interpretability advantage, since individual rules or classifier can be inspected later.</w:t>
       </w:r>
     </w:p>
     <w:p>
       <w:pPr>
         <w:pStyle w:val="Heading1"/>
-        <w:rPr>
-          <w:rFonts w:asciiTheme="minorHAnsi" w:hAnsiTheme="minorHAnsi"/>
-        </w:rPr>
-      </w:pPr>
+      </w:pPr>
+      <w:r>
+        <w:t>Task 2 : Original LCS System</w:t>
+      </w:r>
+    </w:p>
+    <w:p>
+      <w:pPr>
+        <w:pStyle w:val="Heading2"/>
+      </w:pPr>
+      <w:r>
+        <w:t>2.1 baseline lcs setup</w:t>
+      </w:r>
+    </w:p>
+    <w:p>
+      <w:r>
+        <w:t>To establish the original LCS Baseline, we applied the original eLCS model to the WeatherAUS we got from part 1 of the project. We used the target variable , RainTomorrow for the prediction outcome. We ran the original eLCS model to establish the starting performance before handling the later preprocessing, class imbalance and eLCS improvements. The eLCS that was impletmented in this project was imprted from the skeLCS implemtation that was rided to us through the lectuer lab matrial, so we umade use of that after a consultation with out prffessor as opposed to rewriting the classfier system Therefore, our changes focused on adapting the WeatherAUS data pipeline, feature representation, training distribution and eLCS configuration so that the supplied algorithm could be applied and evaluated appropriately on our prediction problem. This allowed the original algorithmic behaviour of eLCS to be retained while making the surrounding implementation specific to the WeatherAUS dataset and the objectives of this project.</w:t>
+      </w:r>
+    </w:p>
+    <w:p>
+      <w:r>
+        <w:t>The minimal compatibility processing was carried out by removing rows with missing RainTomorrow values, converting the target variable from Yes/No to numerical 1/0, removing the Date variable and ordinal encoding the remaining categorical predictors.This ensured that the raw data was usable by the eLCS without introducing later improvement. After removing the missing values in the target variable because the target label was unknown the dataset reduced from 145460 to 142193 records. Witht the remaingn caterogical predictor variables we originally encoded them so that the elCS could still process the dataset numerically, menauwle the enoced coulmns were identified exdpeiciety as discrrte attrivutrs to the eLCS. Class balancing , feature selection , sine/cosine wind encoding or any tuned change the eLCS was not done yet.</w:t>
+      </w:r>
+    </w:p>
+    <w:p>
+      <w:r>
+        <w:t>After the minimal processing took place we were left with 142,193 records and 21 predictor variables, with RainTomorrow retained as the target variable. We then made use of the 80/20 stratified split to divide the dataset, which then resulted in 113,754 training records and 28,439 testing records. We used stratification because the target variable RainTomorrow had an imbalanced class distribution so using the stratification kept the class proportion more similar and made the split more representative of both rain and no rain proportion in both subsets. A random state = 42 for reproducibility and consistency in later experiments.</w:t>
+      </w:r>
+    </w:p>
+    <w:p>
+      <w:r>
+        <w:t>We Trained the baseline eLCS model using 113,754 learning iteration and population size of N=10,000. We set the learning iterations to match the number of training observations so that the learning effort remained proportional to the amount of data available in the training set. N, the population size parameter was used to control the maximum classifier population size. The final eLCS baseline was configured to the settings mentioned above to ensure that later eLCS runs could be compared in later tasks such as Task 4 and Task 6.</w:t>
+      </w:r>
+    </w:p>
+    <w:p>
+      <w:pPr>
+        <w:pStyle w:val="Heading2"/>
+      </w:pPr>
+      <w:r>
+        <w:t>2.2 baseline performance results</w:t>
+      </w:r>
+    </w:p>
+    <w:p>
+      <w:r>
+        <w:t>The original eLCS baseline we used achieved an overall accuracy of 82.95% and a balanced accuracy of 63.84%. In terms of the rain class the model achieved a precision of 0.85, recall of 0.29, and an F1 score of 0.43. At first glance even the thought the overall accuracy was relatively high the rain class recall was much lower. This showed us that the model struggled to identify actual rainy days. Accuracy alone was not reliable since it made the baseline look better than it actually was. The confusion matrix showed us that 21,727 true negatives so no rain observations , and true positives were 1862 meaning 1862 rain observations. These were predicted correctly while the 4513 actual rain observation which were false negatives were incorrectly classified as no rain. The results highlighted the issues that the baseline eLCS was more effective to predict the majority no-rain class compared to the minority rain class, this provided us with a reason to investigate the class imbalance handling an make improvements to the minority class prediction handling we were currently doing.</w:t>
+      </w:r>
     </w:p>
     <w:p>
       <w:pPr>
         <w:pStyle w:val="Heading1"/>
-        <w:rPr>
-          <w:rFonts w:asciiTheme="minorHAnsi" w:eastAsia="Times New Roman" w:hAnsiTheme="minorHAnsi" w:cs="Times New Roman"/>
-          <w:kern w:val="0"/>
-          <w:lang w:eastAsia="en-NZ"/>
-          <w14:ligatures w14:val="none"/>
-        </w:rPr>
-      </w:pPr>
-      <w:r>
-        <w:rPr>
-          <w:rFonts w:asciiTheme="minorHAnsi" w:eastAsia="Times New Roman" w:hAnsiTheme="minorHAnsi" w:cs="Times New Roman"/>
-          <w:kern w:val="0"/>
-          <w:lang w:eastAsia="en-NZ"/>
-          <w14:ligatures w14:val="none"/>
-        </w:rPr>
-        <w:t>Task 2 : Original LCS System</w:t>
-      </w:r>
-    </w:p>
-    <w:p>
-      <w:pPr>
-        <w:pStyle w:val="Heading2"/>
-        <w:rPr>
-          <w:rFonts w:asciiTheme="minorHAnsi" w:eastAsia="Times New Roman" w:hAnsiTheme="minorHAnsi"/>
-        </w:rPr>
-      </w:pPr>
-      <w:r>
-        <w:rPr>
-          <w:rFonts w:asciiTheme="minorHAnsi" w:eastAsia="Times New Roman" w:hAnsiTheme="minorHAnsi"/>
-        </w:rPr>
-        <w:t>2.1 baseline lcs setup</w:t>
-      </w:r>
-    </w:p>
-    <w:p>
-      <w:pPr>
-        <w:pStyle w:val="NormalWeb"/>
-        <w:rPr>
-          <w:rFonts w:asciiTheme="minorHAnsi" w:hAnsiTheme="minorHAnsi"/>
-        </w:rPr>
-      </w:pPr>
-      <w:r>
-        <w:rPr>
-          <w:rFonts w:asciiTheme="minorHAnsi" w:hAnsiTheme="minorHAnsi"/>
-        </w:rPr>
-        <w:t>To establish the original LCS Baseline, we applied the original eLCS model to the WeatherAUS we got from part 1 of the project. We used the target variable , RainTomorrow for the prediction outcome. We ran the original eLCS model to establish the starting performance before handling the later preprocessing, class imbalance and eLCS improvements. The eLCS implementation itself was left unmodified and since the WeatherAUS dataset cannot be directly used by the model to minimal compatibility processing was applied.</w:t>
-      </w:r>
-    </w:p>
-    <w:p>
-      <w:pPr>
-        <w:pStyle w:val="NormalWeb"/>
-        <w:rPr>
-          <w:rFonts w:asciiTheme="minorHAnsi" w:hAnsiTheme="minorHAnsi"/>
-        </w:rPr>
-      </w:pPr>
-      <w:r>
-        <w:rPr>
-          <w:rFonts w:asciiTheme="minorHAnsi" w:hAnsiTheme="minorHAnsi"/>
-        </w:rPr>
-        <w:t xml:space="preserve">The minimal compatibility processing was carried out by , removing the rows missing from RainTomorrow, converting the categorical columns of yes/no to numerical 1/0, removing the date variable and encoding the categorical predictors. This ensured that the raw data was usable by the eLCS without introducing later improvement. After removing the missing values in the target variable because the target label was unknown the dataset reduced from 145460 to 142193 records. As mentioned above the categorical variables were encoded numerically so that the eLCS processing could take </w:t>
-      </w:r>
-      <w:r>
-        <w:rPr>
-          <w:rFonts w:asciiTheme="minorHAnsi" w:hAnsiTheme="minorHAnsi"/>
-        </w:rPr>
-        <w:lastRenderedPageBreak/>
-        <w:t>place. Class balancing , feature selection , sine/cosine wind encoding or any tuned change the eLCS was not done yet.</w:t>
-      </w:r>
-    </w:p>
-    <w:p>
-      <w:pPr>
-        <w:pStyle w:val="NormalWeb"/>
-        <w:rPr>
-          <w:rFonts w:asciiTheme="minorHAnsi" w:hAnsiTheme="minorHAnsi"/>
-        </w:rPr>
-      </w:pPr>
-      <w:r>
-        <w:rPr>
-          <w:rFonts w:asciiTheme="minorHAnsi" w:hAnsiTheme="minorHAnsi"/>
-        </w:rPr>
-        <w:t>After the minimal processing took place we were left with 142193 records and 21 predictor variables, and RainTomorrow still as the target variable. We then made use of the 80/20 stratified split to divide the dataset, which then resulted in 113,754 training records and 28,43 testing records. We used stratification because the target variable RainTomorrow had an imbalanced class distribution so using the stratification kept the class proportion more similar and made the split more representative of both rain and no rain proportion in both subsets. A random state = 42 for reproducibility and consistency in later experiments.</w:t>
-      </w:r>
-    </w:p>
-    <w:p>
-      <w:pPr>
-        <w:pStyle w:val="NormalWeb"/>
-        <w:rPr>
-          <w:rFonts w:asciiTheme="minorHAnsi" w:hAnsiTheme="minorHAnsi"/>
-        </w:rPr>
-      </w:pPr>
-      <w:r>
-        <w:rPr>
-          <w:rFonts w:asciiTheme="minorHAnsi" w:hAnsiTheme="minorHAnsi"/>
-        </w:rPr>
-        <w:t>We Trained the baseline eLCS model using 113,754 learning iteration and population size of N=7000. We set the learning iterations to match the number of train observations, this ensured that each training records could contribute to the learning process across the full run. N, the population size parameter was used to control the maximum classifier population size. The final eLCS baseline was configured to the settings mentioned above to ensure that later eLCS runs could be compared in later tasks such as Task 4 and Task 6.</w:t>
-      </w:r>
-    </w:p>
-    <w:p>
-      <w:pPr>
-        <w:pStyle w:val="Heading2"/>
-        <w:rPr>
-          <w:rFonts w:asciiTheme="minorHAnsi" w:eastAsia="Times New Roman" w:hAnsiTheme="minorHAnsi"/>
-        </w:rPr>
-      </w:pPr>
-      <w:r>
-        <w:rPr>
-          <w:rFonts w:asciiTheme="minorHAnsi" w:eastAsia="Times New Roman" w:hAnsiTheme="minorHAnsi"/>
-        </w:rPr>
-        <w:t>2.2 baseline performance results</w:t>
-      </w:r>
-    </w:p>
-    <w:p>
-      <w:pPr>
-        <w:pStyle w:val="NormalWeb"/>
-        <w:rPr>
-          <w:rFonts w:asciiTheme="minorHAnsi" w:hAnsiTheme="minorHAnsi"/>
-        </w:rPr>
-      </w:pPr>
-      <w:r>
-        <w:rPr>
-          <w:rFonts w:asciiTheme="minorHAnsi" w:hAnsiTheme="minorHAnsi"/>
-        </w:rPr>
-        <w:t>The original eLCS baseline we used achieved an overall accuracy of 82.87% and a balanced accuracy of 63.57%. In terms of the rain class the model achieved a precision of 0.85, recall of 0.29, and an F1 score of 0.43. At first glance even the thought the overall accuracy was relatively high the rain class recall was much lower. This showed us that the model struggled to identify actual rainy days. Accuracy alone was not reliable since it made the baseline look better than it actually was. The confusion matrix showed us that 21.745 true negatives so no rain observations , and true positives were 1822 meaning 1822 rain observations. These were predicted correctly while the 4553 actual rain observation which were false negatives were incorrectly classified as no rain. The results highlighted the issues that the baseline eLCS was more effective to predict the majority no-rain class compared to the minority rain class, this provided us with a reason to investigate the class imbalance handling an make improvements to the minority class prediction handling we were currently doing.</w:t>
+      </w:pPr>
+      <w:r>
+        <w:t>Task 3: Data preprocessing and feature engineering</w:t>
+      </w:r>
+    </w:p>
+    <w:p>
+      <w:pPr>
+        <w:pStyle w:val="Heading2"/>
+      </w:pPr>
+      <w:r>
+        <w:t>3.1 data preprocessing</w:t>
+      </w:r>
+    </w:p>
+    <w:p>
+      <w:r>
+        <w:t>Before we could start modelling the dataset needed preprocessing to address the missing values, invalid values, inconsistent categorical values , outlier and other problems. Missing values present in numerical features were handled using median imputation as mentions before , missing categorical values in features such as WindGustDir, WindDir9am, RainToday were all replaced using the mode. Missing records in RainTomorrow were removed as opposed to being imputed because the target is unknown, so inventing it would give the model false labels.</w:t>
+      </w:r>
+    </w:p>
+    <w:p>
+      <w:r>
+        <w:t>The dataset was also checked for duplicate records, invalid values, and inconsistent categorical labels. Using duplicate checking we were able to identify zero duplicate rows, therefore no duplicate removal was required. Range checks were performed on features such as cloud cover variables, where invalid or unusual values were identified. We then checked the categorical values as mentioned in task 1. Any extreme observation that were found were not automatically removed because extreme weather is plausible and cannot be automatically counted as an error. One such value identified was a Williamtown observation with Evaporation = 145, which was replaced using the evaporation median calculated from the training data. Cloud9am and Cloud3pm were also range chekdd against the expected 0-8 okta scale, with any values aboce 8 were capped at 8. Any other extreme values that we deemed plausible and were consistent with the possible weather observations were retained in the dataset.</w:t>
+      </w:r>
+    </w:p>
+    <w:p>
+      <w:r>
+        <w:t>To ensure that the information form the unseen test set did not influence the precproccesing decision that we used during model training, numerical medican and categorical modes were calculated using the training data and he same values were then applied to the test data. Furthermore to recue the risk of any data leakage we plsit the dataset into training and testing partions before any learnd precproceesin was applied.</w:t>
+      </w:r>
+    </w:p>
+    <w:p>
+      <w:pPr>
+        <w:pStyle w:val="Heading2"/>
+      </w:pPr>
+      <w:r>
+        <w:t>3.2 feature engineering and selection</w:t>
+      </w:r>
+    </w:p>
+    <w:p>
+      <w:r>
+        <w:t>Our original recorded wind direction features were recorded as categorical compass directions, including values such as N, NNW, se etc. so we converted these direction into compass angle.degrees and then transformed them using the sine and cosine methods. Since wind direction is circular the ordinary category numbering would have not preserved that. So the resulting features allowed the model to use wind direction in numerical and model compatible form while maintaining the directional relationship. We also applied this trandfomation speratley to WindGustDir, WindDir9am, and WinDir3pm, with each of the original direcions being replaced with the corresponding sine and cosine features. The Date variable was also separated into Year, Month and Day features before the original Date column was removed,which allowed for the seasonal and temporal information to remain available to the model in numerical form.</w:t>
+      </w:r>
+    </w:p>
+    <w:p>
+      <w:r>
+        <w:t>The Location feature was converted into a numerical mapping based on the locations present in the training data. The mapping was fitted using the training partition only and then applied to the test set, with no unseen locations found in the test partition. Location and RainToday were then specified to eLCS as discrete attributes so that their numerical values were treated as categories rather than continuous measurements. RainToday was separately converted into a binary 0/1 representation.</w:t>
+      </w:r>
+    </w:p>
+    <w:p>
+      <w:r>
+        <w:t>Using correlation analysis and distribution and outlier investigation we examined the feature relationships that we found in phase 1. There were some features such as Humidity3pm, sunshine, RainToday , with showed useful relationships with RainTomorrow. Despite this the features were not removed because of the weak individual correlation and also even if the single-feature relationship is weaker it is still useful for the LCS rules. Therefore we kept the most relevant cleaner weather variables.</w:t>
+      </w:r>
+    </w:p>
+    <w:p>
+      <w:pPr>
+        <w:pStyle w:val="Heading2"/>
+      </w:pPr>
+      <w:r>
+        <w:t>3.3 final processed dataset</w:t>
+      </w:r>
+    </w:p>
+    <w:p>
+      <w:r>
+        <w:t>After cleaning and transformation, the final processed eLCS dataset contained 142,193 observations divided into 113,754 training records and 28,439 testing records, with 27 predictor features in each partition. All predictor features were represented numerically and no missing values remained in either partition. This final leakage-free dataset was then used for the cleaned and improved eLCS experiments.</w:t>
       </w:r>
     </w:p>
     <w:p>
       <w:pPr>
         <w:pStyle w:val="Heading1"/>
-        <w:rPr>
-          <w:rFonts w:asciiTheme="minorHAnsi" w:eastAsia="Times New Roman" w:hAnsiTheme="minorHAnsi"/>
-        </w:rPr>
-      </w:pPr>
-      <w:r>
-        <w:rPr>
-          <w:rFonts w:asciiTheme="minorHAnsi" w:eastAsia="Times New Roman" w:hAnsiTheme="minorHAnsi"/>
-        </w:rPr>
-        <w:t>Task 3: Data preprocessing and feature engineering</w:t>
-      </w:r>
-    </w:p>
-    <w:p>
-      <w:pPr>
-        <w:pStyle w:val="Heading2"/>
-        <w:rPr>
-          <w:rFonts w:asciiTheme="minorHAnsi" w:eastAsia="Times New Roman" w:hAnsiTheme="minorHAnsi"/>
-        </w:rPr>
-      </w:pPr>
-      <w:r>
-        <w:rPr>
-          <w:rFonts w:asciiTheme="minorHAnsi" w:eastAsia="Times New Roman" w:hAnsiTheme="minorHAnsi"/>
-        </w:rPr>
-        <w:t>3.1 data preprocessing</w:t>
-      </w:r>
-    </w:p>
-    <w:p>
-      <w:pPr>
-        <w:pStyle w:val="NormalWeb"/>
-        <w:rPr>
-          <w:rFonts w:asciiTheme="minorHAnsi" w:hAnsiTheme="minorHAnsi"/>
-        </w:rPr>
-      </w:pPr>
-      <w:r>
-        <w:rPr>
-          <w:rFonts w:asciiTheme="minorHAnsi" w:hAnsiTheme="minorHAnsi"/>
-        </w:rPr>
-        <w:t xml:space="preserve">Before we could start modelling the dataset needed preprocessing to address the missing values, invalid values, inconsistent categorical values , outlier and other problems. Missing values present in numerical features were handled using median imputation as mentions before , missing categorical values in features such as WindGustDir, WindDir9am, RainToday were all replaced using the mode. Missing </w:t>
-      </w:r>
-      <w:r>
-        <w:rPr>
-          <w:rFonts w:asciiTheme="minorHAnsi" w:hAnsiTheme="minorHAnsi"/>
-        </w:rPr>
-        <w:lastRenderedPageBreak/>
-        <w:t>records in RainTomorrow were removed as opposed to being imputed because the target is unknown, so inventing it would give the model false labels.</w:t>
-      </w:r>
-    </w:p>
-    <w:p>
-      <w:pPr>
-        <w:pStyle w:val="NormalWeb"/>
-        <w:rPr>
-          <w:rFonts w:asciiTheme="minorHAnsi" w:hAnsiTheme="minorHAnsi"/>
-        </w:rPr>
-      </w:pPr>
-      <w:r>
-        <w:rPr>
-          <w:rFonts w:asciiTheme="minorHAnsi" w:hAnsiTheme="minorHAnsi"/>
-        </w:rPr>
-        <w:t>The dataset was also checked for duplicate records, invalid values, and inconsistent categorical labels. Using duplicate checking we were able to identify zero duplicate rows, therefore no duplicate removal was required. Range checks were performed on features such as cloud cover variables, where invalid or unusual values were identified. We then checked the categorical values as mentioned in task 1. Any extreme observation that were found were not automatically removed because extreme weather is plausible and cannot be automatically counted as an error. One such value identified was Williamtown which had Evaporation = 145, so after investigation it was replaced using an appropriate median value. Any other extreme values that we deemed plausible and were consistent with the possible weather observations were retained in the dataset.</w:t>
-      </w:r>
-    </w:p>
-    <w:p>
-      <w:pPr>
-        <w:pStyle w:val="NormalWeb"/>
-        <w:rPr>
-          <w:rFonts w:asciiTheme="minorHAnsi" w:hAnsiTheme="minorHAnsi"/>
-        </w:rPr>
-      </w:pPr>
-      <w:r>
-        <w:rPr>
-          <w:rFonts w:asciiTheme="minorHAnsi" w:hAnsiTheme="minorHAnsi"/>
-        </w:rPr>
-        <w:t>(Coding part – revise the median/mode statistics then applied to the test set to avoid data leakage).</w:t>
-      </w:r>
-    </w:p>
-    <w:p>
-      <w:pPr>
-        <w:pStyle w:val="Heading2"/>
-        <w:rPr>
-          <w:rFonts w:asciiTheme="minorHAnsi" w:eastAsia="Times New Roman" w:hAnsiTheme="minorHAnsi"/>
-        </w:rPr>
-      </w:pPr>
-      <w:r>
-        <w:rPr>
-          <w:rFonts w:asciiTheme="minorHAnsi" w:eastAsia="Times New Roman" w:hAnsiTheme="minorHAnsi"/>
-        </w:rPr>
-        <w:t>3.2 feature engineering and selection</w:t>
-      </w:r>
-    </w:p>
-    <w:p>
-      <w:pPr>
-        <w:pStyle w:val="NormalWeb"/>
-        <w:rPr>
-          <w:rFonts w:asciiTheme="minorHAnsi" w:hAnsiTheme="minorHAnsi"/>
-        </w:rPr>
-      </w:pPr>
-      <w:r>
-        <w:rPr>
-          <w:rFonts w:asciiTheme="minorHAnsi" w:hAnsiTheme="minorHAnsi"/>
-        </w:rPr>
-        <w:t>Our original recorded wind direction features were recorded as categorical compass directions, including values such as N, NNW, se etc. so we converted these direction into compass angle.degrees and then transformed them using the sine and cosine methods. Since wind direction is circular the ordinary category numbering would have not preserved that. So the resulting features allowed the model to use wind direction in numerical and model compatible form while maintaining the directional relationship.</w:t>
-      </w:r>
-    </w:p>
-    <w:p>
-      <w:pPr>
-        <w:pStyle w:val="NormalWeb"/>
-        <w:rPr>
-          <w:rFonts w:asciiTheme="minorHAnsi" w:hAnsiTheme="minorHAnsi"/>
-        </w:rPr>
-      </w:pPr>
-      <w:r>
-        <w:rPr>
-          <w:rFonts w:asciiTheme="minorHAnsi" w:hAnsiTheme="minorHAnsi"/>
-        </w:rPr>
-        <w:t>For the location feature one-hot encoding was used to transform. One-hot encoding was preferred because since locations have no meaningful numerical ranking , assigning arbitrary number could imply a fake distance. Other binary categorical variables such as RainToday were converted or transformed into numerical binary representation. Finally these transformation converted the remaining categorical information into numerical inputs suitable for eLCS/conventional models.</w:t>
-      </w:r>
-    </w:p>
-    <w:p>
-      <w:pPr>
-        <w:pStyle w:val="NormalWeb"/>
-        <w:rPr>
-          <w:rFonts w:asciiTheme="minorHAnsi" w:hAnsiTheme="minorHAnsi"/>
-        </w:rPr>
-      </w:pPr>
-      <w:r>
-        <w:rPr>
-          <w:rFonts w:asciiTheme="minorHAnsi" w:hAnsiTheme="minorHAnsi"/>
-        </w:rPr>
-        <w:t>Using correlation analysis and distribution and outlier investigation we examined the feature relationships that we found in phase 1. There were some features such as Humidity3pm, sunshine, RainToday , with showed useful relationships with RainTomorrow. Despite this the features were not removed because of the weak individual correlation and also even if the single-feature relationship is weaker it is still useful for the LCS rules. Therefore we kept the most relevant cleaner weather variables.</w:t>
-      </w:r>
-    </w:p>
-    <w:p>
-      <w:pPr>
-        <w:pStyle w:val="NormalWeb"/>
-        <w:rPr>
-          <w:rFonts w:asciiTheme="minorHAnsi" w:hAnsiTheme="minorHAnsi"/>
-        </w:rPr>
-      </w:pPr>
-      <w:r>
-        <w:rPr>
-          <w:rFonts w:asciiTheme="minorHAnsi" w:hAnsiTheme="minorHAnsi"/>
-        </w:rPr>
-        <w:t>[CODING PART – add any final feature-selection method if one is later implemented.]</w:t>
-      </w:r>
-    </w:p>
-    <w:p>
-      <w:pPr>
-        <w:pStyle w:val="NormalWeb"/>
-        <w:rPr>
-          <w:rFonts w:asciiTheme="minorHAnsi" w:hAnsiTheme="minorHAnsi"/>
-        </w:rPr>
-      </w:pPr>
-      <w:r>
-        <w:rPr>
-          <w:rFonts w:asciiTheme="minorHAnsi" w:hAnsiTheme="minorHAnsi"/>
-        </w:rPr>
-        <w:t>Initial attempt data attempt sections</w:t>
-      </w:r>
-    </w:p>
-    <w:p>
-      <w:pPr>
-        <w:pStyle w:val="Heading2"/>
-        <w:rPr>
-          <w:rFonts w:asciiTheme="minorHAnsi" w:eastAsia="Times New Roman" w:hAnsiTheme="minorHAnsi"/>
-        </w:rPr>
-      </w:pPr>
-      <w:r>
-        <w:rPr>
-          <w:rFonts w:asciiTheme="minorHAnsi" w:eastAsia="Times New Roman" w:hAnsiTheme="minorHAnsi"/>
-        </w:rPr>
-        <w:lastRenderedPageBreak/>
-        <w:t>3.3 final processed dataset</w:t>
-      </w:r>
-    </w:p>
-    <w:p>
-      <w:pPr>
-        <w:pStyle w:val="NormalWeb"/>
-        <w:rPr>
-          <w:rFonts w:asciiTheme="minorHAnsi" w:hAnsiTheme="minorHAnsi"/>
-        </w:rPr>
-      </w:pPr>
-      <w:r>
-        <w:rPr>
-          <w:rFonts w:asciiTheme="minorHAnsi" w:hAnsiTheme="minorHAnsi"/>
-        </w:rPr>
-        <w:t>After cleaning and transformation , the processed dataset contains 142,13 rows and approximately 76 columns in the full encoded dataset. Due to one hot encoding there was a significant increase in the number of columns, particularly in the location variable. Numerical features were found on the processed dataset which then made it suitable for the eLCS and the implementing other conventional ML models. To later investigate if reducing feature space would make the eLCS more manageable and efficient a more compact processed dataset was also produced.</w:t>
+      </w:pPr>
+      <w:r>
+        <w:t>Task 4: improved lcs based system</w:t>
+      </w:r>
+    </w:p>
+    <w:p>
+      <w:pPr>
+        <w:pStyle w:val="Heading2"/>
+      </w:pPr>
+      <w:r>
+        <w:t>4.1 proposed lcs improvements</w:t>
+      </w:r>
+    </w:p>
+    <w:p>
+      <w:r>
+        <w:t>The main problem that was identified in the baseline eLCS was the poor detection of the minority rain class, despite achieving an overall accuracy of 82.95%. As mentioned before this were reflected in the rain class recall of 0.29 and the f1 score of 0.43, which proved that many actual rainy days were missing and overall accuracy wasn’t an accurate representation of the minority class performance. The the Target variable RainTomorrow had a significant class distribution issue , it was imbalanced with around 110k no rain compared to 32k rain observations. So the proposed improvements to improve this imbalance are improving the rain class detecting rather than just taking overall accuracy into account. The aim of the improved system was to therefore increase rain recall, and rain F1, while maintaining reasonable and balanced overall accuracy. Therfoe the iprpved system combines the leakage free preproceesing pipeline with he aprtial majority class undersmapling while also retaiing the same core eLCS implantation.</w:t>
+      </w:r>
+    </w:p>
+    <w:p>
+      <w:r>
+        <w:t>The novely of the improved system I this project stems from adapting the surrounding eLCS pipeline rather than changi the inter eLCS algortithm , the lectuer privied eLCS itself wa retained. IN comparison to the orignla basleine , the improved system combined leakage free preprocessing , circular wind encindg , tmeparal features and parital 2:1 class balancing. Each of these chahges corresponds to an actual proen idneiifeid in the data. Nstead of changing the core leanrinf classfir algorithm the novielty is in the data reepestnain , training distution an dexdpermikantla pipeline.</w:t>
+      </w:r>
+    </w:p>
+    <w:p>
+      <w:pPr>
+        <w:pStyle w:val="Heading2"/>
+      </w:pPr>
+      <w:r>
+        <w:t>4.2 improved system implementation</w:t>
+      </w:r>
+    </w:p>
+    <w:p>
+      <w:r>
+        <w:t>After the proposed changes, the final improved eLCS was trained using a total of 76,506 training observations which were taken from the processed dataset. The observations came from the training partition not the test set. The training subset on the other hand contained 51,004 no-rain observations and 25,502 rain observations, producing a class ratio of 2:1. The majority no-rain class was randomly undersampled as opposed to oversampling since oversampling would increase the training size while also repeating the same minority observations. The test set was left unchanged with 22,064 no-rain observations and 6,375 rain observations because balancing it would artificially change the evaluation problem, and performance should be measured against naturally imbalanced unseen data. Therefore the modified class distribution only affected the training while the evaluation represented the original class distribution.</w:t>
+      </w:r>
+    </w:p>
+    <w:p>
+      <w:r>
+        <w:t>The improved eLCS was configured with a population size of N=10k, the N limits how many classifier rules the eLCS can maintain and this was kept consistent with the final baseline and cleaned eLCS models. The number of learning iterations = 76,506, so there were 76,506 records in the improved training subset, this kept the training effort proportional to the amount of data we used. A random state of 42 was retained so that the sampled training subset could be reproduced and the comparisons would appear more consistent.</w:t>
+      </w:r>
+    </w:p>
+    <w:p>
+      <w:pPr>
+        <w:pStyle w:val="Heading2"/>
+      </w:pPr>
+      <w:r>
+        <w:t>4.3 comparison with the baseline lcs</w:t>
+      </w:r>
+    </w:p>
+    <w:p>
+      <w:r>
+        <w:t>The final improved system was then compared with the original baseline eLCS that was trained on the raw processed WeatherAUS Dataset. This was done to evaluate whether the proposed changes had improved the eLCS performance. The original baseline achieved an accuracy of 82.95% and 63.84% balanced accuracy, and the rain class recall and F1 score were 0.29 and 0.43 respectively. An intermediate cleaned eLCS was also evaluated on the processed dataset to find out whether preprocessing alone could address the weakness.. Despite this the cleaned eLCS produced a rain recall of approximately 0.25 and an F1 score of approximately 0.39 meaning that preprocessing alone did not fix the minority rain detection so we later turned to balancing.</w:t>
+      </w:r>
+    </w:p>
+    <w:p>
+      <w:r>
+        <w:t>After partial class balancing was introduced the final system achieved an accuracy of 84.10% and 71.07% balanced accuracy which was a significant increase. This increase in balanced accuracy was important because it meant that RainTomorrow the target variable performance across both classes would be reflected more evenly. In terms of the minority rain class, the recall increased from 0.29 in the original baseline to 0.47 in the improved system, while the F1 score increased from 0.43 to 0.57 meaning that in the recall more rainy days were detected and in the F1 there was a better overall balance between precision and recall. This reduced the number of false negatives that were initially shown to 3350 from the initial number of 4513. This meant that the improved system missed 1163 fewer rain observations which is a significant and important change in train our model. In terms of the trade off the rain precision decreased from 0.85 to 0.72, while the false positives increased from 337 to 1173. This showed us that even though a higher prediction of rain was being carried out it came at the cost of more incorrect rain predictions. I conclusion the final improved configuration provided stronger minority class detecting , better balance between the two classes and higher balanced accuracy compared to the baseline as opposed to simply maximising precision of ordinary accuracy.</w:t>
+      </w:r>
+    </w:p>
+    <w:p>
+      <w:pPr>
+        <w:pStyle w:val="Heading2"/>
+      </w:pPr>
+      <w:r>
+        <w:t xml:space="preserve">Task 5: </w:t>
+      </w:r>
+    </w:p>
+    <w:p>
+      <w:r>
+        <w:t>In terms of validation all final models were evaluated using an 80% training and 20% testing split, the 80/20 stratified rain test split based on the target variable RainTomorrow so in the final test set there 28,439 observations observed. We used stratification because of the imbalanced class distribution present in RainTomorrow so it prevented one split from having an unusually different class distribution. The 80/20 ratio also provided enough observation we needed for model learning while also retaining a sizable unseen test set. We also kept the test partition separate from the model training and used it only for the final performance evaluation to avoid the information leakage and overly optimistic evaluation. We used the training partition to calcite the medina, mode and he category mapping values and then applied the test data so the test set did not influence the preprocessing stage.</w:t>
+      </w:r>
+    </w:p>
+    <w:p>
+      <w:r>
+        <w:t>IN the improved eLCS, we applied changes only to the 2:1 training sampling data we talked about in the above section while we kept the test set untouched so the original rain/no rain distribution was retained. Keeping the test set untouched was very important since it allowed for the unseen data to reflect the natural imbalance during evaluation. Across all the final models , where possible the same test partition was used to ensure that each model evaluated the same observation so that performance difference were less likely to come from different samples. This also allowed for paired statistical comparison of model prediction using the [MCNEMAR test need to do still]</w:t>
+      </w:r>
+    </w:p>
+    <w:p>
+      <w:pPr>
+        <w:pStyle w:val="Heading2"/>
+      </w:pPr>
+      <w:r>
+        <w:t>5.2 Evaluation Metrics</w:t>
+      </w:r>
+    </w:p>
+    <w:p>
+      <w:r>
+        <w:t>Accuracy , Balanced accuracy , precision, recall, F1 score, and the confusion matrix were all used to assess the model Performance. The accuracy measured that all the proportion of all predictions were correctly classified, but it was not considered sufficient on its own since RainTomorrow is imbalanced it could mean that a majority no rain class could dominate our result. This limitations was first visible to us in the original eLCS which as mentioned before achieved an accuracy of 82.95% while the rain recall only remained at 0.29 which proved to us that accuracy was not completely reliable. Therefore to account for the predictive performance across both classes more evenly balanced accuracy was included.</w:t>
+      </w:r>
+    </w:p>
+    <w:p>
+      <w:r>
+        <w:t>Since the main weakness of the baseline eLCS was poor rain detection we specially examined the precision , recall and F1 score for the rain class. The rain precision identifies how many of the predictions that were labelled rain were actually predictions of rain, meanwhile the rain recall tells us the actual rain observation, and how many were detected. The recall is mentioned many times throughout this report and is especially important because it helps reduce missing rain observation which is the reason that the baseline eLCS had so many false negatives. The f1 score was used because we need both precision and recall together . having them together made sure that later when we the trade off happened during balancing we were able to catch it. The confusion matrix was examined to identify True/False positives and negative, allowing any changes that were missed in the rain observation and false rain predictions to be analysed directly in our model training.</w:t>
+      </w:r>
+    </w:p>
+    <w:p>
+      <w:pPr>
+        <w:pStyle w:val="Heading2"/>
+      </w:pPr>
+      <w:r>
+        <w:t>5.3 Statistical Testing</w:t>
+      </w:r>
+    </w:p>
+    <w:p>
+      <w:r>
+        <w:t>To statistically compare the predictions between the models, we used the McNemar test. The McNemar test is used when two models are evaluated on the same test observations, which made it suitable for this project because the models were compared using the same test partition. Rather than only comparing the overall accuracy values, the test focuses on the observations where one model predicted correctly while the other model predicted incorrectly. This allowed us to determine whether the difference between two models was likely to represent a real difference in prediction behaviour rather than just random variation. A significance level of 0.05 was used, meaning that a p-value below 0.05 was treated as a statistically significant difference.</w:t>
+      </w:r>
+    </w:p>
+    <w:p>
+      <w:r>
+        <w:t>The first comparison was carried out between the cleaned eLCS and the improved eLCS to determine whether the class balancing changes had produced a significant difference. The cleaned eLCS correctly predicted 894 observations that the improved eLCS predicted incorrectly, while the improved eLCS correctly predicted 1,418 observations that the cleaned eLCS missed. The McNemar test produced a statistic of 118.31 and a p-value of approximately 1.48 x 10-27. Since this p-value was far below 0.05, the difference between the cleaned and improved eLCS was statistically significant. This supported that the change in prediction performance after introducing the improved training approach was unlikely to have occurred only because of random variation.</w:t>
+      </w:r>
+    </w:p>
+    <w:p>
+      <w:r>
+        <w:t>The improved eLCS was also compared with Random Forest to determine whether the performance difference between the LCS-based system and a conventional model was statistically significant. The improved eLCS correctly predicted 1,380 observations that Random Forest missed, while Random Forest correctly predicted 1,590 observations that the improved eLCS missed. The McNemar test produced a statistic of 14.71 with a p-value of 0.000126. Since this was also below the 0.05 significance level, the prediction difference between the improved eLCS and Random Forest was statistically significant. However, statistical significance does not automatically mean that one model is better in every way, so the class-specific metrics such as rain recall, precision and F1 score were still considered alongside the statistical test when comparing the models.</w:t>
       </w:r>
     </w:p>
     <w:p>
       <w:pPr>
         <w:pStyle w:val="Heading1"/>
-        <w:rPr>
-          <w:rFonts w:asciiTheme="minorHAnsi" w:eastAsia="Times New Roman" w:hAnsiTheme="minorHAnsi"/>
-        </w:rPr>
-      </w:pPr>
-      <w:r>
-        <w:rPr>
-          <w:rFonts w:asciiTheme="minorHAnsi" w:eastAsia="Times New Roman" w:hAnsiTheme="minorHAnsi"/>
-        </w:rPr>
-        <w:t>Task 4: improved lcs based system</w:t>
-      </w:r>
-    </w:p>
-    <w:p>
-      <w:pPr>
-        <w:pStyle w:val="Heading2"/>
-        <w:rPr>
-          <w:rFonts w:asciiTheme="minorHAnsi" w:eastAsia="Times New Roman" w:hAnsiTheme="minorHAnsi"/>
-        </w:rPr>
-      </w:pPr>
-      <w:r>
-        <w:rPr>
-          <w:rFonts w:asciiTheme="minorHAnsi" w:eastAsia="Times New Roman" w:hAnsiTheme="minorHAnsi"/>
-        </w:rPr>
-        <w:t>4.1 proposed lcs improvements</w:t>
-      </w:r>
-    </w:p>
-    <w:p>
-      <w:pPr>
-        <w:pStyle w:val="NormalWeb"/>
-        <w:rPr>
-          <w:rFonts w:asciiTheme="minorHAnsi" w:hAnsiTheme="minorHAnsi"/>
-        </w:rPr>
-      </w:pPr>
-      <w:r>
-        <w:rPr>
-          <w:rFonts w:asciiTheme="minorHAnsi" w:hAnsiTheme="minorHAnsi"/>
-        </w:rPr>
-        <w:t>The main problem that was identified in the baseline eLCS was the poor detection of the minority rain class, despite achieving an overall accuracy of 82.87%. As mentioned before this were reflected in the rain class recall of 0.29 and the f1 score of 0.43, which proved that many actual rainy days were missing and overall accuracy wasn’t an accurate representation of the minority class performance. The the Target variable RainTomorrow had a significant class distribution issue , it was imbalanced with around 110k no rain compared to 32k rain observations. So the proposed improvements to improve this imbalance are improving the rain class detecting rather than just taking overall accuracy into account. The aim of the improved system was to therefore increase rain recall, and rain F1, while maintaining reasonable and balanced overall accuracy</w:t>
-      </w:r>
-    </w:p>
-    <w:p>
-      <w:pPr>
-        <w:pStyle w:val="Heading2"/>
-        <w:rPr>
-          <w:rFonts w:asciiTheme="minorHAnsi" w:eastAsia="Times New Roman" w:hAnsiTheme="minorHAnsi"/>
-        </w:rPr>
-      </w:pPr>
-      <w:r>
-        <w:rPr>
-          <w:rFonts w:asciiTheme="minorHAnsi" w:eastAsia="Times New Roman" w:hAnsiTheme="minorHAnsi"/>
-        </w:rPr>
-        <w:t>4.2 improved system implementation</w:t>
-      </w:r>
-    </w:p>
-    <w:p>
-      <w:pPr>
-        <w:pStyle w:val="NormalWeb"/>
-        <w:rPr>
-          <w:rFonts w:asciiTheme="minorHAnsi" w:hAnsiTheme="minorHAnsi"/>
-        </w:rPr>
-      </w:pPr>
-      <w:r>
-        <w:rPr>
-          <w:rFonts w:asciiTheme="minorHAnsi" w:hAnsiTheme="minorHAnsi"/>
-        </w:rPr>
-        <w:t>After the proposed changes, the final improved eLCS was trained using a total of 30k training observations which were taken from the processed dataset. The observations came from training the partition not the test set. The training subset on the other hand contained 20k no-rain observations and 10k rain observation with a producing class ratio of 2:1. The majority no rain class was randomly undersampled as opposed to oversampling since oversampling would increase the training size while also making the same minority observations. The test set was left unchanged because balancing it would artificially change the evaluation problem, and performance should be measured against naturally imbalanced unseen data. Therefore the modified class distribution only affected the training while the evaluation represented the original class distribution.</w:t>
-      </w:r>
-    </w:p>
-    <w:p>
-      <w:pPr>
-        <w:pStyle w:val="NormalWeb"/>
-        <w:rPr>
-          <w:rFonts w:asciiTheme="minorHAnsi" w:hAnsiTheme="minorHAnsi"/>
-        </w:rPr>
-      </w:pPr>
-      <w:r>
-        <w:rPr>
-          <w:rFonts w:asciiTheme="minorHAnsi" w:hAnsiTheme="minorHAnsi"/>
-        </w:rPr>
-        <w:t xml:space="preserve">The improved eLCS was configured with a population size of N= 10k, the N limits how many classifier rules the eLCS can maintain however our baseline population was 7k. Increasing the model from 7k to 10k increased it capacity to retain the rules, especially after reducing the majority class dominance through sampling. Despite this it does not give guaranteed better performance but it does give a higher capacity. The number of </w:t>
-      </w:r>
-      <w:r>
-        <w:rPr>
-          <w:rFonts w:asciiTheme="minorHAnsi" w:hAnsiTheme="minorHAnsi"/>
-        </w:rPr>
-        <w:lastRenderedPageBreak/>
-        <w:t>learning iteration = 30k, so there were 30k records in the training subset, this kept the training effort proportional to the amount of data we used. To avoid unnecessarily long runs during tuning, which did take up a lot of our time and caused a lot of issues we used a smaller sample size of 10k iteration development run for the final system. This maintained a consistent training approach while avoiding excessive computation cost as well. A random state of 42 was retained so that the sampled training subset could be reproduced and the comparisons would appear more consistent.</w:t>
-      </w:r>
-    </w:p>
-    <w:p>
-      <w:pPr>
-        <w:pStyle w:val="Heading2"/>
-        <w:rPr>
-          <w:rFonts w:asciiTheme="minorHAnsi" w:eastAsia="Times New Roman" w:hAnsiTheme="minorHAnsi"/>
-        </w:rPr>
-      </w:pPr>
-      <w:r>
-        <w:rPr>
-          <w:rFonts w:asciiTheme="minorHAnsi" w:eastAsia="Times New Roman" w:hAnsiTheme="minorHAnsi"/>
-        </w:rPr>
-        <w:t>4.3 comparison with the baseline lcs</w:t>
-      </w:r>
-    </w:p>
-    <w:p>
-      <w:pPr>
-        <w:pStyle w:val="NormalWeb"/>
-        <w:rPr>
-          <w:rFonts w:asciiTheme="minorHAnsi" w:hAnsiTheme="minorHAnsi"/>
-        </w:rPr>
-      </w:pPr>
-      <w:r>
-        <w:rPr>
-          <w:rFonts w:asciiTheme="minorHAnsi" w:hAnsiTheme="minorHAnsi"/>
-        </w:rPr>
-        <w:t>The final improved system was then compared with the original baseline eLCS that was trained on the raw processed WeatherAUS Dataset. This was done to evaluate whether the proposed changes had improved the eLCS performance. The original baseline achieved an accuracy of 82.87% and 63.57% accuracy, and the rain class recall and F1 score were 0.2 and 0.43 respectively. An intermediate eLCS was also evaluated on the cleaned or preprocessed dataset to find out whether preprocessing alone could address the weakness. Despite this the preprocessed eLCS produced a rain recall of approximately 0.20 and an F1 score of approximately 0.33 meaning that preprocessing alone did not fix the minority rain detection so we later turned to balancing and tuning.</w:t>
-      </w:r>
-    </w:p>
-    <w:p>
-      <w:pPr>
-        <w:pStyle w:val="NormalWeb"/>
-        <w:rPr>
-          <w:rFonts w:asciiTheme="minorHAnsi" w:hAnsiTheme="minorHAnsi"/>
-        </w:rPr>
-      </w:pPr>
-      <w:r>
-        <w:rPr>
-          <w:rFonts w:asciiTheme="minorHAnsi" w:hAnsiTheme="minorHAnsi"/>
-        </w:rPr>
-        <w:t>After partial class balancing and eLCS parameter tuning were introduced the final system achieved an accuracy of 84.01% and 70.66% balanced accuracy which was a significant increase. This increase in balanced accuracy was important because it meant that RainTomorrow the target variable performance across both classes would be reflected more evenly. In terms of the minority rain class, the recall increased from 0.29 in the original baseline to 0.46 in the improved system, while the F1 score increased from 0.43 to 0.57 meaning that in the recall more rainy days were detected and in the F1 there was a better overall balance between precision and recall. This reduced the number of false negatives that were initially shown to 3413 from the initial number of 4553. This meant that the improved system missed 1140 fewer rain observations which is a significant and important change in train our model. In terms of the trade off the rain precision decreased from 0.85 to 0.72, while the false positives increased from 319 to 1135. This showed us that even though a higher prediction of rain was being carried out it came at the cost of more incorrect rain predictions. I conclusion the final improved configuration provided stronger minority class detecting , better balance between the two classes and higher balanced accuracy compared to the baseline as opposed to simply maximising precision of ordinary accuracy.</w:t>
-      </w:r>
-    </w:p>
-    <w:p>
-      <w:r>
-        <w:rPr>
-          <w:rFonts w:eastAsia="Times New Roman" w:cs="Times New Roman"/>
-          <w:kern w:val="0"/>
-          <w:lang w:eastAsia="en-NZ"/>
-          <w14:ligatures w14:val="none"/>
-        </w:rPr>
-        <w:t>Add table for three of the following original eLCS , preprocessed eLCS and final improved eLCS.</w:t>
-      </w:r>
-    </w:p>
+      </w:pPr>
+      <w:r>
+        <w:t>Task 6:</w:t>
+      </w:r>
+    </w:p>
+    <w:p>
+      <w:pPr>
+        <w:pStyle w:val="Heading2"/>
+      </w:pPr>
+      <w:r>
+        <w:t>6.1 Models Compared</w:t>
+      </w:r>
+    </w:p>
+    <w:p>
+      <w:pPr>
+        <w:pStyle w:val="Heading2"/>
+      </w:pPr>
+      <w:r>
+        <w:t>6.2 Comparison Rsults</w:t>
+      </w:r>
+    </w:p>
+    <w:p>
+      <w:pPr>
+        <w:pStyle w:val="Heading1"/>
+      </w:pPr>
+      <w:r>
+        <w:t>Task 7:</w:t>
+      </w:r>
+    </w:p>
+    <w:p>
+      <w:pPr>
+        <w:pStyle w:val="Heading2"/>
+      </w:pPr>
+      <w:r>
+        <w:t>7.1 Main Findings</w:t>
+      </w:r>
+    </w:p>
+    <w:p>
+      <w:pPr>
+        <w:pStyle w:val="Heading2"/>
+      </w:pPr>
+      <w:r>
+        <w:t>7.2 LCS Rules</w:t>
+      </w:r>
+    </w:p>
+    <w:p>
+      <w:pPr>
+        <w:pStyle w:val="Heading2"/>
+      </w:pPr>
+      <w:r>
+        <w:t>7.3 Interpretability/Trustworthiness</w:t>
+      </w:r>
+    </w:p>
+    <w:p>
+      <w:pPr>
+        <w:pStyle w:val="Heading1"/>
+      </w:pPr>
+      <w:r>
+        <w:t>Task 8:</w:t>
+      </w:r>
+    </w:p>
+    <w:p>
+      <w:pPr>
+        <w:pStyle w:val="Heading2"/>
+      </w:pPr>
+      <w:r>
+        <w:t>8.1 Discussion</w:t>
+      </w:r>
+    </w:p>
+    <w:p>
+      <w:pPr>
+        <w:pStyle w:val="Heading2"/>
+      </w:pPr>
+      <w:r>
+        <w:t>8.2 Limitations</w:t>
+      </w:r>
+    </w:p>
+    <w:p/>
     <w:sectPr>
       <w:pgSz w:w="11906" w:h="16838"/>
       <w:pgMar w:top="1440" w:right="1440" w:bottom="1440" w:left="1440" w:header="708" w:footer="708" w:gutter="0"/>
@@ -873,11 +623,11 @@
       </w:rPr>
     </w:lvl>
   </w:abstractNum>
-  <w:num w:numId="1" w16cid:durableId="1759138557">
+  <w:num w:numId="1" w16cid:durableId="1701664136">
+    <w:abstractNumId w:val="0"/>
+  </w:num>
+  <w:num w:numId="2" w16cid:durableId="1759138557">
     <w:abstractNumId w:val="1"/>
-  </w:num>
-  <w:num w:numId="2" w16cid:durableId="1701664136">
-    <w:abstractNumId w:val="0"/>
   </w:num>
 </w:numbering>
 </file>
@@ -1282,7 +1032,7 @@
   <w:style w:type="paragraph" w:default="1" w:styleId="Normal">
     <w:name w:val="Normal"/>
     <w:qFormat/>
-    <w:rsid w:val="00780B58"/>
+    <w:rsid w:val="00DF53F9"/>
   </w:style>
   <w:style w:type="paragraph" w:styleId="Heading1">
     <w:name w:val="heading 1"/>

</xml_diff>